<commit_message>
v1.13.2: Docs: storage locations, movement log and bulk relocation; preservation fixity baselines and collation fix
</commit_message>
<xml_diff>
--- a/docs/technical/ahgStorageManagePlugin.docx
+++ b/docs/technical/ahgStorageManagePlugin.docx
@@ -2,6 +2,22 @@
 <file path=word/document.xml><?xml version="1.0" encoding="utf-8"?>
 <w:document xmlns:w="http://schemas.openxmlformats.org/wordprocessingml/2006/main" xmlns:m="http://schemas.openxmlformats.org/officeDocument/2006/math" xmlns:r="http://schemas.openxmlformats.org/officeDocument/2006/relationships" xmlns:o="urn:schemas-microsoft-com:office:office" xmlns:v="urn:schemas-microsoft-com:vml" xmlns:w10="urn:schemas-microsoft-com:office:word" xmlns:a="http://schemas.openxmlformats.org/drawingml/2006/main" xmlns:pic="http://schemas.openxmlformats.org/drawingml/2006/picture" xmlns:wp="http://schemas.openxmlformats.org/drawingml/2006/wordprocessingDrawing">
   <w:body>
+    <w:p>
+      <w:pPr>
+        <w:pStyle w:val="Title"/>
+      </w:pPr>
+      <w:r>
+        <w:t xml:space="preserve">ahgStorageManagePlugin - Technical Documentation</w:t>
+      </w:r>
+    </w:p>
+    <w:p>
+      <w:pPr>
+        <w:pStyle w:val="Author"/>
+      </w:pPr>
+      <w:r>
+        <w:t xml:space="preserve">The Archive and Heritage Group (Pty) Ltd</w:t>
+      </w:r>
+    </w:p>
     <w:sdt>
       <w:sdtPr>
         <w:docPartObj>
@@ -28,7 +44,7 @@
         </w:p>
       </w:sdtContent>
     </w:sdt>
-    <w:bookmarkStart w:id="30" w:name="Xbd3dbf54061d5a1da1f3a3e01f93c0ca4346496"/>
+    <w:bookmarkStart w:id="32" w:name="Xbd3dbf54061d5a1da1f3a3e01f93c0ca4346496"/>
     <w:p>
       <w:pPr>
         <w:pStyle w:val="Heading1"/>
@@ -300,6 +316,162 @@
           <w:rStyle w:val="VerbatimChar"/>
         </w:rPr>
         <w:t xml:space="preserve">ahg_strongroom</w:t>
+      </w:r>
+    </w:p>
+    <w:p>
+      <w:pPr>
+        <w:numPr>
+          <w:ilvl w:val="0"/>
+          <w:numId w:val="1003"/>
+        </w:numPr>
+        <w:pStyle w:val="Compact"/>
+      </w:pPr>
+      <w:r>
+        <w:rPr>
+          <w:rStyle w:val="VerbatimChar"/>
+        </w:rPr>
+        <w:t xml:space="preserve">ahg_storage_location</w:t>
+      </w:r>
+      <w:r>
+        <w:t xml:space="preserve"> </w:t>
+      </w:r>
+      <w:r>
+        <w:t xml:space="preserve">- the hierarchy.</w:t>
+      </w:r>
+      <w:r>
+        <w:t xml:space="preserve"> </w:t>
+      </w:r>
+      <w:r>
+        <w:rPr>
+          <w:rStyle w:val="VerbatimChar"/>
+        </w:rPr>
+        <w:t xml:space="preserve">parent_id</w:t>
+      </w:r>
+      <w:r>
+        <w:t xml:space="preserve"> </w:t>
+      </w:r>
+      <w:r>
+        <w:t xml:space="preserve">is the source of truth;</w:t>
+      </w:r>
+      <w:r>
+        <w:t xml:space="preserve"> </w:t>
+      </w:r>
+      <w:r>
+        <w:rPr>
+          <w:rStyle w:val="VerbatimChar"/>
+        </w:rPr>
+        <w:t xml:space="preserve">level</w:t>
+      </w:r>
+      <w:r>
+        <w:t xml:space="preserve"> </w:t>
+      </w:r>
+      <w:r>
+        <w:t xml:space="preserve">is denormalised depth, kept for ordering and recomputed for a subtree after a move.</w:t>
+      </w:r>
+    </w:p>
+    <w:p>
+      <w:pPr>
+        <w:numPr>
+          <w:ilvl w:val="0"/>
+          <w:numId w:val="1003"/>
+        </w:numPr>
+        <w:pStyle w:val="Compact"/>
+      </w:pPr>
+      <w:r>
+        <w:rPr>
+          <w:rStyle w:val="VerbatimChar"/>
+        </w:rPr>
+        <w:t xml:space="preserve">ahg_storage_location_closure</w:t>
+      </w:r>
+      <w:r>
+        <w:t xml:space="preserve"> </w:t>
+      </w:r>
+      <w:r>
+        <w:t xml:space="preserve">- a maintained index of every (ancestor, descendant, depth) pair, including self-pairs at depth 0, updated in the same transaction as the row. Subtree, path and cycle checks are single indexed queries.</w:t>
+      </w:r>
+      <w:r>
+        <w:t xml:space="preserve"> </w:t>
+      </w:r>
+      <w:r>
+        <w:rPr>
+          <w:rStyle w:val="VerbatimChar"/>
+        </w:rPr>
+        <w:t xml:space="preserve">install.sql</w:t>
+      </w:r>
+      <w:r>
+        <w:t xml:space="preserve"> </w:t>
+      </w:r>
+      <w:r>
+        <w:t xml:space="preserve">carries an idempotent backfill;</w:t>
+      </w:r>
+      <w:r>
+        <w:t xml:space="preserve"> </w:t>
+      </w:r>
+      <w:r>
+        <w:rPr>
+          <w:rStyle w:val="VerbatimChar"/>
+        </w:rPr>
+        <w:t xml:space="preserve">rebuildClosure()</w:t>
+      </w:r>
+      <w:r>
+        <w:t xml:space="preserve"> </w:t>
+      </w:r>
+      <w:r>
+        <w:t xml:space="preserve">re-derives it from</w:t>
+      </w:r>
+      <w:r>
+        <w:t xml:space="preserve"> </w:t>
+      </w:r>
+      <w:r>
+        <w:rPr>
+          <w:rStyle w:val="VerbatimChar"/>
+        </w:rPr>
+        <w:t xml:space="preserve">parent_id</w:t>
+      </w:r>
+      <w:r>
+        <w:t xml:space="preserve">.</w:t>
+      </w:r>
+    </w:p>
+    <w:p>
+      <w:pPr>
+        <w:numPr>
+          <w:ilvl w:val="0"/>
+          <w:numId w:val="1003"/>
+        </w:numPr>
+        <w:pStyle w:val="Compact"/>
+      </w:pPr>
+      <w:r>
+        <w:rPr>
+          <w:rStyle w:val="VerbatimChar"/>
+        </w:rPr>
+        <w:t xml:space="preserve">ahg_physical_object_location</w:t>
+      </w:r>
+      <w:r>
+        <w:t xml:space="preserve"> </w:t>
+      </w:r>
+      <w:r>
+        <w:t xml:space="preserve">- one row per object, the current-state index, written in the same transaction as the movement row.</w:t>
+      </w:r>
+    </w:p>
+    <w:p>
+      <w:pPr>
+        <w:numPr>
+          <w:ilvl w:val="0"/>
+          <w:numId w:val="1003"/>
+        </w:numPr>
+        <w:pStyle w:val="Compact"/>
+      </w:pPr>
+      <w:r>
+        <w:rPr>
+          <w:rStyle w:val="VerbatimChar"/>
+        </w:rPr>
+        <w:t xml:space="preserve">ahg_storage_movement</w:t>
+      </w:r>
+      <w:r>
+        <w:t xml:space="preserve"> </w:t>
+      </w:r>
+      <w:r>
+        <w:t xml:space="preserve">- append-only movement log.</w:t>
       </w:r>
     </w:p>
     <w:p>
@@ -564,6 +736,446 @@
           </w:p>
         </w:tc>
       </w:tr>
+      <w:tr>
+        <w:tc>
+          <w:tcPr/>
+          <w:p>
+            <w:pPr>
+              <w:pStyle w:val="Compact"/>
+              <w:jc w:val="left"/>
+            </w:pPr>
+            <w:r>
+              <w:rPr>
+                <w:rStyle w:val="VerbatimChar"/>
+              </w:rPr>
+              <w:t xml:space="preserve">storagelocation_browse</w:t>
+            </w:r>
+          </w:p>
+        </w:tc>
+        <w:tc>
+          <w:tcPr/>
+          <w:p>
+            <w:pPr>
+              <w:pStyle w:val="Compact"/>
+              <w:jc w:val="left"/>
+            </w:pPr>
+            <w:r>
+              <w:rPr>
+                <w:rStyle w:val="VerbatimChar"/>
+              </w:rPr>
+              <w:t xml:space="preserve">/storagelocation/browse</w:t>
+            </w:r>
+          </w:p>
+        </w:tc>
+        <w:tc>
+          <w:tcPr/>
+          <w:p>
+            <w:pPr>
+              <w:pStyle w:val="Compact"/>
+              <w:jc w:val="left"/>
+            </w:pPr>
+            <w:r>
+              <w:t xml:space="preserve">browse</w:t>
+            </w:r>
+          </w:p>
+        </w:tc>
+      </w:tr>
+      <w:tr>
+        <w:tc>
+          <w:tcPr/>
+          <w:p>
+            <w:pPr>
+              <w:pStyle w:val="Compact"/>
+              <w:jc w:val="left"/>
+            </w:pPr>
+            <w:r>
+              <w:rPr>
+                <w:rStyle w:val="VerbatimChar"/>
+              </w:rPr>
+              <w:t xml:space="preserve">storagelocation_view</w:t>
+            </w:r>
+          </w:p>
+        </w:tc>
+        <w:tc>
+          <w:tcPr/>
+          <w:p>
+            <w:pPr>
+              <w:pStyle w:val="Compact"/>
+              <w:jc w:val="left"/>
+            </w:pPr>
+            <w:r>
+              <w:rPr>
+                <w:rStyle w:val="VerbatimChar"/>
+              </w:rPr>
+              <w:t xml:space="preserve">/storagelocation/view</w:t>
+            </w:r>
+          </w:p>
+        </w:tc>
+        <w:tc>
+          <w:tcPr/>
+          <w:p>
+            <w:pPr>
+              <w:pStyle w:val="Compact"/>
+              <w:jc w:val="left"/>
+            </w:pPr>
+            <w:r>
+              <w:t xml:space="preserve">view</w:t>
+            </w:r>
+          </w:p>
+        </w:tc>
+      </w:tr>
+      <w:tr>
+        <w:tc>
+          <w:tcPr/>
+          <w:p>
+            <w:pPr>
+              <w:pStyle w:val="Compact"/>
+              <w:jc w:val="left"/>
+            </w:pPr>
+            <w:r>
+              <w:rPr>
+                <w:rStyle w:val="VerbatimChar"/>
+              </w:rPr>
+              <w:t xml:space="preserve">storagelocation_create</w:t>
+            </w:r>
+          </w:p>
+        </w:tc>
+        <w:tc>
+          <w:tcPr/>
+          <w:p>
+            <w:pPr>
+              <w:pStyle w:val="Compact"/>
+              <w:jc w:val="left"/>
+            </w:pPr>
+            <w:r>
+              <w:rPr>
+                <w:rStyle w:val="VerbatimChar"/>
+              </w:rPr>
+              <w:t xml:space="preserve">/storagelocation/add</w:t>
+            </w:r>
+          </w:p>
+        </w:tc>
+        <w:tc>
+          <w:tcPr/>
+          <w:p>
+            <w:pPr>
+              <w:pStyle w:val="Compact"/>
+              <w:jc w:val="left"/>
+            </w:pPr>
+            <w:r>
+              <w:t xml:space="preserve">create</w:t>
+            </w:r>
+          </w:p>
+        </w:tc>
+      </w:tr>
+      <w:tr>
+        <w:tc>
+          <w:tcPr/>
+          <w:p>
+            <w:pPr>
+              <w:pStyle w:val="Compact"/>
+              <w:jc w:val="left"/>
+            </w:pPr>
+            <w:r>
+              <w:rPr>
+                <w:rStyle w:val="VerbatimChar"/>
+              </w:rPr>
+              <w:t xml:space="preserve">storagelocation_save</w:t>
+            </w:r>
+          </w:p>
+        </w:tc>
+        <w:tc>
+          <w:tcPr/>
+          <w:p>
+            <w:pPr>
+              <w:pStyle w:val="Compact"/>
+              <w:jc w:val="left"/>
+            </w:pPr>
+            <w:r>
+              <w:rPr>
+                <w:rStyle w:val="VerbatimChar"/>
+              </w:rPr>
+              <w:t xml:space="preserve">/storagelocation/save</w:t>
+            </w:r>
+          </w:p>
+        </w:tc>
+        <w:tc>
+          <w:tcPr/>
+          <w:p>
+            <w:pPr>
+              <w:pStyle w:val="Compact"/>
+              <w:jc w:val="left"/>
+            </w:pPr>
+            <w:r>
+              <w:t xml:space="preserve">save</w:t>
+            </w:r>
+          </w:p>
+        </w:tc>
+      </w:tr>
+      <w:tr>
+        <w:tc>
+          <w:tcPr/>
+          <w:p>
+            <w:pPr>
+              <w:pStyle w:val="Compact"/>
+              <w:jc w:val="left"/>
+            </w:pPr>
+            <w:r>
+              <w:rPr>
+                <w:rStyle w:val="VerbatimChar"/>
+              </w:rPr>
+              <w:t xml:space="preserve">storagelocation_edit</w:t>
+            </w:r>
+          </w:p>
+        </w:tc>
+        <w:tc>
+          <w:tcPr/>
+          <w:p>
+            <w:pPr>
+              <w:pStyle w:val="Compact"/>
+              <w:jc w:val="left"/>
+            </w:pPr>
+            <w:r>
+              <w:rPr>
+                <w:rStyle w:val="VerbatimChar"/>
+              </w:rPr>
+              <w:t xml:space="preserve">/storagelocation/edit</w:t>
+            </w:r>
+          </w:p>
+        </w:tc>
+        <w:tc>
+          <w:tcPr/>
+          <w:p>
+            <w:pPr>
+              <w:pStyle w:val="Compact"/>
+              <w:jc w:val="left"/>
+            </w:pPr>
+            <w:r>
+              <w:t xml:space="preserve">edit</w:t>
+            </w:r>
+          </w:p>
+        </w:tc>
+      </w:tr>
+      <w:tr>
+        <w:tc>
+          <w:tcPr/>
+          <w:p>
+            <w:pPr>
+              <w:pStyle w:val="Compact"/>
+              <w:jc w:val="left"/>
+            </w:pPr>
+            <w:r>
+              <w:rPr>
+                <w:rStyle w:val="VerbatimChar"/>
+              </w:rPr>
+              <w:t xml:space="preserve">storagelocation_update</w:t>
+            </w:r>
+          </w:p>
+        </w:tc>
+        <w:tc>
+          <w:tcPr/>
+          <w:p>
+            <w:pPr>
+              <w:pStyle w:val="Compact"/>
+              <w:jc w:val="left"/>
+            </w:pPr>
+            <w:r>
+              <w:rPr>
+                <w:rStyle w:val="VerbatimChar"/>
+              </w:rPr>
+              <w:t xml:space="preserve">/storagelocation/update</w:t>
+            </w:r>
+          </w:p>
+        </w:tc>
+        <w:tc>
+          <w:tcPr/>
+          <w:p>
+            <w:pPr>
+              <w:pStyle w:val="Compact"/>
+              <w:jc w:val="left"/>
+            </w:pPr>
+            <w:r>
+              <w:t xml:space="preserve">update</w:t>
+            </w:r>
+          </w:p>
+        </w:tc>
+      </w:tr>
+      <w:tr>
+        <w:tc>
+          <w:tcPr/>
+          <w:p>
+            <w:pPr>
+              <w:pStyle w:val="Compact"/>
+              <w:jc w:val="left"/>
+            </w:pPr>
+            <w:r>
+              <w:rPr>
+                <w:rStyle w:val="VerbatimChar"/>
+              </w:rPr>
+              <w:t xml:space="preserve">storagelocation_delete</w:t>
+            </w:r>
+          </w:p>
+        </w:tc>
+        <w:tc>
+          <w:tcPr/>
+          <w:p>
+            <w:pPr>
+              <w:pStyle w:val="Compact"/>
+              <w:jc w:val="left"/>
+            </w:pPr>
+            <w:r>
+              <w:rPr>
+                <w:rStyle w:val="VerbatimChar"/>
+              </w:rPr>
+              <w:t xml:space="preserve">/storagelocation/delete</w:t>
+            </w:r>
+          </w:p>
+        </w:tc>
+        <w:tc>
+          <w:tcPr/>
+          <w:p>
+            <w:pPr>
+              <w:pStyle w:val="Compact"/>
+              <w:jc w:val="left"/>
+            </w:pPr>
+            <w:r>
+              <w:t xml:space="preserve">delete</w:t>
+            </w:r>
+          </w:p>
+        </w:tc>
+      </w:tr>
+      <w:tr>
+        <w:tc>
+          <w:tcPr/>
+          <w:p>
+            <w:pPr>
+              <w:pStyle w:val="Compact"/>
+              <w:jc w:val="left"/>
+            </w:pPr>
+            <w:r>
+              <w:rPr>
+                <w:rStyle w:val="VerbatimChar"/>
+              </w:rPr>
+              <w:t xml:space="preserve">storagelocation_move_objects</w:t>
+            </w:r>
+          </w:p>
+        </w:tc>
+        <w:tc>
+          <w:tcPr/>
+          <w:p>
+            <w:pPr>
+              <w:pStyle w:val="Compact"/>
+              <w:jc w:val="left"/>
+            </w:pPr>
+            <w:r>
+              <w:rPr>
+                <w:rStyle w:val="VerbatimChar"/>
+              </w:rPr>
+              <w:t xml:space="preserve">/storagelocation/moveObjects</w:t>
+            </w:r>
+          </w:p>
+        </w:tc>
+        <w:tc>
+          <w:tcPr/>
+          <w:p>
+            <w:pPr>
+              <w:pStyle w:val="Compact"/>
+              <w:jc w:val="left"/>
+            </w:pPr>
+            <w:r>
+              <w:t xml:space="preserve">moveObjects</w:t>
+            </w:r>
+          </w:p>
+        </w:tc>
+      </w:tr>
+      <w:tr>
+        <w:tc>
+          <w:tcPr/>
+          <w:p>
+            <w:pPr>
+              <w:pStyle w:val="Compact"/>
+              <w:jc w:val="left"/>
+            </w:pPr>
+            <w:r>
+              <w:rPr>
+                <w:rStyle w:val="VerbatimChar"/>
+              </w:rPr>
+              <w:t xml:space="preserve">storagelocation_api_locations</w:t>
+            </w:r>
+          </w:p>
+        </w:tc>
+        <w:tc>
+          <w:tcPr/>
+          <w:p>
+            <w:pPr>
+              <w:pStyle w:val="Compact"/>
+              <w:jc w:val="left"/>
+            </w:pPr>
+            <w:r>
+              <w:rPr>
+                <w:rStyle w:val="VerbatimChar"/>
+              </w:rPr>
+              <w:t xml:space="preserve">/storagelocation/api/locations</w:t>
+            </w:r>
+          </w:p>
+        </w:tc>
+        <w:tc>
+          <w:tcPr/>
+          <w:p>
+            <w:pPr>
+              <w:pStyle w:val="Compact"/>
+              <w:jc w:val="left"/>
+            </w:pPr>
+            <w:r>
+              <w:t xml:space="preserve">apiLocations</w:t>
+            </w:r>
+          </w:p>
+        </w:tc>
+      </w:tr>
+      <w:tr>
+        <w:tc>
+          <w:tcPr/>
+          <w:p>
+            <w:pPr>
+              <w:pStyle w:val="Compact"/>
+              <w:jc w:val="left"/>
+            </w:pPr>
+            <w:r>
+              <w:rPr>
+                <w:rStyle w:val="VerbatimChar"/>
+              </w:rPr>
+              <w:t xml:space="preserve">storagelocation_api_tree</w:t>
+            </w:r>
+          </w:p>
+        </w:tc>
+        <w:tc>
+          <w:tcPr/>
+          <w:p>
+            <w:pPr>
+              <w:pStyle w:val="Compact"/>
+              <w:jc w:val="left"/>
+            </w:pPr>
+            <w:r>
+              <w:rPr>
+                <w:rStyle w:val="VerbatimChar"/>
+              </w:rPr>
+              <w:t xml:space="preserve">/storagelocation/api/tree</w:t>
+            </w:r>
+          </w:p>
+        </w:tc>
+        <w:tc>
+          <w:tcPr/>
+          <w:p>
+            <w:pPr>
+              <w:pStyle w:val="Compact"/>
+              <w:jc w:val="left"/>
+            </w:pPr>
+            <w:r>
+              <w:t xml:space="preserve">apiTree</w:t>
+            </w:r>
+          </w:p>
+        </w:tc>
+      </w:tr>
     </w:tbl>
     <w:bookmarkEnd w:id="23"/>
     <w:bookmarkStart w:id="24" w:name="module-actions"/>
@@ -739,7 +1351,7 @@
         <w:t xml:space="preserve"> </w:t>
       </w:r>
       <w:r>
-        <w:t xml:space="preserve">—</w:t>
+        <w:t xml:space="preserve">-</w:t>
       </w:r>
       <w:r>
         <w:t xml:space="preserve"> </w:t>
@@ -822,9 +1434,295 @@
         </w:rPr>
         <w:t xml:space="preserve">unassign</w:t>
       </w:r>
+      <w:r>
+        <w:t xml:space="preserve"> </w:t>
+      </w:r>
+      <w:r>
+        <w:rPr>
+          <w:rStyle w:val="VerbatimChar"/>
+          <w:bCs/>
+          <w:b/>
+        </w:rPr>
+        <w:t xml:space="preserve">storageLocation</w:t>
+      </w:r>
+      <w:r>
+        <w:t xml:space="preserve"> </w:t>
+      </w:r>
+      <w:r>
+        <w:t xml:space="preserve">-</w:t>
+      </w:r>
+      <w:r>
+        <w:t xml:space="preserve"> </w:t>
+      </w:r>
+      <w:r>
+        <w:rPr>
+          <w:rStyle w:val="VerbatimChar"/>
+        </w:rPr>
+        <w:t xml:space="preserve">browse</w:t>
+      </w:r>
+      <w:r>
+        <w:t xml:space="preserve">,</w:t>
+      </w:r>
+      <w:r>
+        <w:t xml:space="preserve"> </w:t>
+      </w:r>
+      <w:r>
+        <w:rPr>
+          <w:rStyle w:val="VerbatimChar"/>
+        </w:rPr>
+        <w:t xml:space="preserve">view</w:t>
+      </w:r>
+      <w:r>
+        <w:t xml:space="preserve">,</w:t>
+      </w:r>
+      <w:r>
+        <w:t xml:space="preserve"> </w:t>
+      </w:r>
+      <w:r>
+        <w:rPr>
+          <w:rStyle w:val="VerbatimChar"/>
+        </w:rPr>
+        <w:t xml:space="preserve">create</w:t>
+      </w:r>
+      <w:r>
+        <w:t xml:space="preserve">,</w:t>
+      </w:r>
+      <w:r>
+        <w:t xml:space="preserve"> </w:t>
+      </w:r>
+      <w:r>
+        <w:rPr>
+          <w:rStyle w:val="VerbatimChar"/>
+        </w:rPr>
+        <w:t xml:space="preserve">save</w:t>
+      </w:r>
+      <w:r>
+        <w:t xml:space="preserve">,</w:t>
+      </w:r>
+      <w:r>
+        <w:t xml:space="preserve"> </w:t>
+      </w:r>
+      <w:r>
+        <w:rPr>
+          <w:rStyle w:val="VerbatimChar"/>
+        </w:rPr>
+        <w:t xml:space="preserve">edit</w:t>
+      </w:r>
+      <w:r>
+        <w:t xml:space="preserve">,</w:t>
+      </w:r>
+      <w:r>
+        <w:t xml:space="preserve"> </w:t>
+      </w:r>
+      <w:r>
+        <w:rPr>
+          <w:rStyle w:val="VerbatimChar"/>
+        </w:rPr>
+        <w:t xml:space="preserve">update</w:t>
+      </w:r>
+      <w:r>
+        <w:t xml:space="preserve">,</w:t>
+      </w:r>
+      <w:r>
+        <w:t xml:space="preserve"> </w:t>
+      </w:r>
+      <w:r>
+        <w:rPr>
+          <w:rStyle w:val="VerbatimChar"/>
+        </w:rPr>
+        <w:t xml:space="preserve">delete</w:t>
+      </w:r>
+      <w:r>
+        <w:t xml:space="preserve">,</w:t>
+      </w:r>
+      <w:r>
+        <w:t xml:space="preserve"> </w:t>
+      </w:r>
+      <w:r>
+        <w:rPr>
+          <w:rStyle w:val="VerbatimChar"/>
+        </w:rPr>
+        <w:t xml:space="preserve">moveObjects</w:t>
+      </w:r>
+      <w:r>
+        <w:t xml:space="preserve">,</w:t>
+      </w:r>
+      <w:r>
+        <w:t xml:space="preserve"> </w:t>
+      </w:r>
+      <w:r>
+        <w:rPr>
+          <w:rStyle w:val="VerbatimChar"/>
+        </w:rPr>
+        <w:t xml:space="preserve">apiLocations</w:t>
+      </w:r>
+      <w:r>
+        <w:t xml:space="preserve">,</w:t>
+      </w:r>
+      <w:r>
+        <w:t xml:space="preserve"> </w:t>
+      </w:r>
+      <w:r>
+        <w:rPr>
+          <w:rStyle w:val="VerbatimChar"/>
+        </w:rPr>
+        <w:t xml:space="preserve">apiTree</w:t>
+      </w:r>
+      <w:r>
+        <w:t xml:space="preserve">,</w:t>
+      </w:r>
+      <w:r>
+        <w:t xml:space="preserve"> </w:t>
+      </w:r>
+      <w:r>
+        <w:rPr>
+          <w:rStyle w:val="VerbatimChar"/>
+        </w:rPr>
+        <w:t xml:space="preserve">apiSearch</w:t>
+      </w:r>
+    </w:p>
+    <w:p>
+      <w:pPr>
+        <w:pStyle w:val="BodyText"/>
+      </w:pPr>
+      <w:r>
+        <w:rPr>
+          <w:rStyle w:val="VerbatimChar"/>
+        </w:rPr>
+        <w:t xml:space="preserve">storageLocation</w:t>
+      </w:r>
+      <w:r>
+        <w:t xml:space="preserve"> </w:t>
+      </w:r>
+      <w:r>
+        <w:t xml:space="preserve">must appear in</w:t>
+      </w:r>
+      <w:r>
+        <w:t xml:space="preserve"> </w:t>
+      </w:r>
+      <w:r>
+        <w:rPr>
+          <w:rStyle w:val="VerbatimChar"/>
+        </w:rPr>
+        <w:t xml:space="preserve">sf_enabled_modules</w:t>
+      </w:r>
+      <w:r>
+        <w:t xml:space="preserve"> </w:t>
+      </w:r>
+      <w:r>
+        <w:t xml:space="preserve">(set in the plugin configuration class) or every URL throws</w:t>
+      </w:r>
+      <w:r>
+        <w:t xml:space="preserve"> </w:t>
+      </w:r>
+      <w:r>
+        <w:rPr>
+          <w:rStyle w:val="VerbatimChar"/>
+        </w:rPr>
+        <w:t xml:space="preserve">sfConfigurationException</w:t>
+      </w:r>
+      <w:r>
+        <w:t xml:space="preserve"> </w:t>
+      </w:r>
+      <w:r>
+        <w:t xml:space="preserve">before the action loads. Its</w:t>
+      </w:r>
+      <w:r>
+        <w:t xml:space="preserve"> </w:t>
+      </w:r>
+      <w:r>
+        <w:rPr>
+          <w:rStyle w:val="VerbatimChar"/>
+        </w:rPr>
+        <w:t xml:space="preserve">config/security.yml</w:t>
+      </w:r>
+      <w:r>
+        <w:t xml:space="preserve"> </w:t>
+      </w:r>
+      <w:r>
+        <w:t xml:space="preserve">is not optional: the application default is</w:t>
+      </w:r>
+      <w:r>
+        <w:t xml:space="preserve"> </w:t>
+      </w:r>
+      <w:r>
+        <w:rPr>
+          <w:rStyle w:val="VerbatimChar"/>
+        </w:rPr>
+        <w:t xml:space="preserve">is_secure: false</w:t>
+      </w:r>
+      <w:r>
+        <w:t xml:space="preserve">, so a module without one leaves</w:t>
+      </w:r>
+      <w:r>
+        <w:t xml:space="preserve"> </w:t>
+      </w:r>
+      <w:r>
+        <w:rPr>
+          <w:rStyle w:val="VerbatimChar"/>
+        </w:rPr>
+        <w:t xml:space="preserve">save</w:t>
+      </w:r>
+      <w:r>
+        <w:t xml:space="preserve">,</w:t>
+      </w:r>
+      <w:r>
+        <w:t xml:space="preserve"> </w:t>
+      </w:r>
+      <w:r>
+        <w:rPr>
+          <w:rStyle w:val="VerbatimChar"/>
+        </w:rPr>
+        <w:t xml:space="preserve">update</w:t>
+      </w:r>
+      <w:r>
+        <w:t xml:space="preserve">,</w:t>
+      </w:r>
+      <w:r>
+        <w:t xml:space="preserve"> </w:t>
+      </w:r>
+      <w:r>
+        <w:rPr>
+          <w:rStyle w:val="VerbatimChar"/>
+        </w:rPr>
+        <w:t xml:space="preserve">delete</w:t>
+      </w:r>
+      <w:r>
+        <w:t xml:space="preserve"> </w:t>
+      </w:r>
+      <w:r>
+        <w:t xml:space="preserve">and</w:t>
+      </w:r>
+      <w:r>
+        <w:t xml:space="preserve"> </w:t>
+      </w:r>
+      <w:r>
+        <w:rPr>
+          <w:rStyle w:val="VerbatimChar"/>
+        </w:rPr>
+        <w:t xml:space="preserve">moveObjects</w:t>
+      </w:r>
+      <w:r>
+        <w:t xml:space="preserve"> </w:t>
+      </w:r>
+      <w:r>
+        <w:t xml:space="preserve">reachable anonymously. Reads are public; writes require</w:t>
+      </w:r>
+      <w:r>
+        <w:t xml:space="preserve"> </w:t>
+      </w:r>
+      <w:r>
+        <w:rPr>
+          <w:rStyle w:val="VerbatimChar"/>
+        </w:rPr>
+        <w:t xml:space="preserve">administrator</w:t>
+      </w:r>
+      <w:r>
+        <w:t xml:space="preserve">.</w:t>
+      </w:r>
     </w:p>
     <w:bookmarkEnd w:id="24"/>
-    <w:bookmarkStart w:id="28" w:name="service-layer"/>
+    <w:bookmarkStart w:id="30" w:name="service-layer"/>
     <w:p>
       <w:pPr>
         <w:pStyle w:val="Heading2"/>
@@ -1184,8 +2082,634 @@
       </w:r>
     </w:p>
     <w:bookmarkEnd w:id="27"/>
+    <w:bookmarkStart w:id="28" w:name="storagelocationservice"/>
+    <w:p>
+      <w:pPr>
+        <w:pStyle w:val="Heading3"/>
+      </w:pPr>
+      <w:r>
+        <w:rPr>
+          <w:rStyle w:val="VerbatimChar"/>
+        </w:rPr>
+        <w:t xml:space="preserve">StorageLocationService</w:t>
+      </w:r>
+    </w:p>
+    <w:p>
+      <w:pPr>
+        <w:pStyle w:val="FirstParagraph"/>
+      </w:pPr>
+      <w:r>
+        <w:rPr>
+          <w:rStyle w:val="VerbatimChar"/>
+        </w:rPr>
+        <w:t xml:space="preserve">lib/Services/StorageLocationService.php</w:t>
+      </w:r>
+    </w:p>
+    <w:p>
+      <w:pPr>
+        <w:pStyle w:val="BodyText"/>
+      </w:pPr>
+      <w:r>
+        <w:t xml:space="preserve">Public methods:</w:t>
+      </w:r>
+      <w:r>
+        <w:t xml:space="preserve"> </w:t>
+      </w:r>
+      <w:r>
+        <w:rPr>
+          <w:rStyle w:val="VerbatimChar"/>
+        </w:rPr>
+        <w:t xml:space="preserve">createLocation()</w:t>
+      </w:r>
+      <w:r>
+        <w:t xml:space="preserve">,</w:t>
+      </w:r>
+      <w:r>
+        <w:t xml:space="preserve"> </w:t>
+      </w:r>
+      <w:r>
+        <w:rPr>
+          <w:rStyle w:val="VerbatimChar"/>
+        </w:rPr>
+        <w:t xml:space="preserve">updateLocation()</w:t>
+      </w:r>
+      <w:r>
+        <w:t xml:space="preserve">,</w:t>
+      </w:r>
+      <w:r>
+        <w:t xml:space="preserve"> </w:t>
+      </w:r>
+      <w:r>
+        <w:rPr>
+          <w:rStyle w:val="VerbatimChar"/>
+        </w:rPr>
+        <w:t xml:space="preserve">deleteLocation()</w:t>
+      </w:r>
+      <w:r>
+        <w:t xml:space="preserve">,</w:t>
+      </w:r>
+      <w:r>
+        <w:t xml:space="preserve"> </w:t>
+      </w:r>
+      <w:r>
+        <w:rPr>
+          <w:rStyle w:val="VerbatimChar"/>
+        </w:rPr>
+        <w:t xml:space="preserve">getLocationById()</w:t>
+      </w:r>
+      <w:r>
+        <w:t xml:space="preserve">,</w:t>
+      </w:r>
+      <w:r>
+        <w:t xml:space="preserve"> </w:t>
+      </w:r>
+      <w:r>
+        <w:rPr>
+          <w:rStyle w:val="VerbatimChar"/>
+        </w:rPr>
+        <w:t xml:space="preserve">getLocations()</w:t>
+      </w:r>
+      <w:r>
+        <w:t xml:space="preserve">,</w:t>
+      </w:r>
+      <w:r>
+        <w:t xml:space="preserve"> </w:t>
+      </w:r>
+      <w:r>
+        <w:rPr>
+          <w:rStyle w:val="VerbatimChar"/>
+        </w:rPr>
+        <w:t xml:space="preserve">getLocationTree()</w:t>
+      </w:r>
+      <w:r>
+        <w:t xml:space="preserve">,</w:t>
+      </w:r>
+      <w:r>
+        <w:t xml:space="preserve"> </w:t>
+      </w:r>
+      <w:r>
+        <w:rPr>
+          <w:rStyle w:val="VerbatimChar"/>
+        </w:rPr>
+        <w:t xml:space="preserve">getLocationPath()</w:t>
+      </w:r>
+      <w:r>
+        <w:t xml:space="preserve">,</w:t>
+      </w:r>
+      <w:r>
+        <w:t xml:space="preserve"> </w:t>
+      </w:r>
+      <w:r>
+        <w:rPr>
+          <w:rStyle w:val="VerbatimChar"/>
+        </w:rPr>
+        <w:t xml:space="preserve">getDescendants()</w:t>
+      </w:r>
+      <w:r>
+        <w:t xml:space="preserve">,</w:t>
+      </w:r>
+      <w:r>
+        <w:t xml:space="preserve"> </w:t>
+      </w:r>
+      <w:r>
+        <w:rPr>
+          <w:rStyle w:val="VerbatimChar"/>
+        </w:rPr>
+        <w:t xml:space="preserve">getChildren()</w:t>
+      </w:r>
+      <w:r>
+        <w:t xml:space="preserve">,</w:t>
+      </w:r>
+      <w:r>
+        <w:t xml:space="preserve"> </w:t>
+      </w:r>
+      <w:r>
+        <w:rPr>
+          <w:rStyle w:val="VerbatimChar"/>
+        </w:rPr>
+        <w:t xml:space="preserve">getAllLocationsWithHierarchy()</w:t>
+      </w:r>
+      <w:r>
+        <w:t xml:space="preserve">,</w:t>
+      </w:r>
+      <w:r>
+        <w:t xml:space="preserve"> </w:t>
+      </w:r>
+      <w:r>
+        <w:rPr>
+          <w:rStyle w:val="VerbatimChar"/>
+        </w:rPr>
+        <w:t xml:space="preserve">searchLocations()</w:t>
+      </w:r>
+      <w:r>
+        <w:t xml:space="preserve">,</w:t>
+      </w:r>
+      <w:r>
+        <w:t xml:space="preserve"> </w:t>
+      </w:r>
+      <w:r>
+        <w:rPr>
+          <w:rStyle w:val="VerbatimChar"/>
+        </w:rPr>
+        <w:t xml:space="preserve">rebuildClosure()</w:t>
+      </w:r>
+    </w:p>
+    <w:p>
+      <w:pPr>
+        <w:pStyle w:val="BodyText"/>
+      </w:pPr>
+      <w:r>
+        <w:t xml:space="preserve">Notes: reads do not swallow database errors, so a missing table surfaces as a failure rather than an empty screen. Slugs fold accents and take a numeric discriminator on collision. Clearing</w:t>
+      </w:r>
+      <w:r>
+        <w:t xml:space="preserve"> </w:t>
+      </w:r>
+      <w:r>
+        <w:rPr>
+          <w:rStyle w:val="VerbatimChar"/>
+        </w:rPr>
+        <w:t xml:space="preserve">parent_id</w:t>
+      </w:r>
+      <w:r>
+        <w:t xml:space="preserve"> </w:t>
+      </w:r>
+      <w:r>
+        <w:t xml:space="preserve">moves a location to the root. A location that has children, holds objects, or appears in the movement log cannot be deleted.</w:t>
+      </w:r>
+    </w:p>
     <w:bookmarkEnd w:id="28"/>
-    <w:bookmarkStart w:id="29" w:name="standards-conventions"/>
+    <w:bookmarkStart w:id="29" w:name="storagemovementservice"/>
+    <w:p>
+      <w:pPr>
+        <w:pStyle w:val="Heading3"/>
+      </w:pPr>
+      <w:r>
+        <w:rPr>
+          <w:rStyle w:val="VerbatimChar"/>
+        </w:rPr>
+        <w:t xml:space="preserve">StorageMovementService</w:t>
+      </w:r>
+    </w:p>
+    <w:p>
+      <w:pPr>
+        <w:pStyle w:val="FirstParagraph"/>
+      </w:pPr>
+      <w:r>
+        <w:rPr>
+          <w:rStyle w:val="VerbatimChar"/>
+        </w:rPr>
+        <w:t xml:space="preserve">lib/Services/StorageMovementService.php</w:t>
+      </w:r>
+    </w:p>
+    <w:p>
+      <w:pPr>
+        <w:pStyle w:val="BodyText"/>
+      </w:pPr>
+      <w:r>
+        <w:t xml:space="preserve">Public methods:</w:t>
+      </w:r>
+      <w:r>
+        <w:t xml:space="preserve"> </w:t>
+      </w:r>
+      <w:r>
+        <w:rPr>
+          <w:rStyle w:val="VerbatimChar"/>
+        </w:rPr>
+        <w:t xml:space="preserve">moveObject()</w:t>
+      </w:r>
+      <w:r>
+        <w:t xml:space="preserve">,</w:t>
+      </w:r>
+      <w:r>
+        <w:t xml:space="preserve"> </w:t>
+      </w:r>
+      <w:r>
+        <w:rPr>
+          <w:rStyle w:val="VerbatimChar"/>
+        </w:rPr>
+        <w:t xml:space="preserve">moveObjects()</w:t>
+      </w:r>
+      <w:r>
+        <w:t xml:space="preserve">,</w:t>
+      </w:r>
+      <w:r>
+        <w:t xml:space="preserve"> </w:t>
+      </w:r>
+      <w:r>
+        <w:rPr>
+          <w:rStyle w:val="VerbatimChar"/>
+        </w:rPr>
+        <w:t xml:space="preserve">recordLocationMove()</w:t>
+      </w:r>
+      <w:r>
+        <w:t xml:space="preserve">,</w:t>
+      </w:r>
+      <w:r>
+        <w:t xml:space="preserve"> </w:t>
+      </w:r>
+      <w:r>
+        <w:rPr>
+          <w:rStyle w:val="VerbatimChar"/>
+        </w:rPr>
+        <w:t xml:space="preserve">historyFor()</w:t>
+      </w:r>
+      <w:r>
+        <w:t xml:space="preserve">,</w:t>
+      </w:r>
+      <w:r>
+        <w:t xml:space="preserve"> </w:t>
+      </w:r>
+      <w:r>
+        <w:rPr>
+          <w:rStyle w:val="VerbatimChar"/>
+        </w:rPr>
+        <w:t xml:space="preserve">historyForLocation()</w:t>
+      </w:r>
+      <w:r>
+        <w:t xml:space="preserve">,</w:t>
+      </w:r>
+      <w:r>
+        <w:t xml:space="preserve"> </w:t>
+      </w:r>
+      <w:r>
+        <w:rPr>
+          <w:rStyle w:val="VerbatimChar"/>
+        </w:rPr>
+        <w:t xml:space="preserve">batch()</w:t>
+      </w:r>
+      <w:r>
+        <w:t xml:space="preserve">,</w:t>
+      </w:r>
+      <w:r>
+        <w:t xml:space="preserve"> </w:t>
+      </w:r>
+      <w:r>
+        <w:rPr>
+          <w:rStyle w:val="VerbatimChar"/>
+        </w:rPr>
+        <w:t xml:space="preserve">objectsIn()</w:t>
+      </w:r>
+      <w:r>
+        <w:t xml:space="preserve">,</w:t>
+      </w:r>
+      <w:r>
+        <w:t xml:space="preserve"> </w:t>
+      </w:r>
+      <w:r>
+        <w:rPr>
+          <w:rStyle w:val="VerbatimChar"/>
+        </w:rPr>
+        <w:t xml:space="preserve">currentLocationOf()</w:t>
+      </w:r>
+      <w:r>
+        <w:t xml:space="preserve">,</w:t>
+      </w:r>
+      <w:r>
+        <w:t xml:space="preserve"> </w:t>
+      </w:r>
+      <w:r>
+        <w:rPr>
+          <w:rStyle w:val="VerbatimChar"/>
+        </w:rPr>
+        <w:t xml:space="preserve">newBatchId()</w:t>
+      </w:r>
+    </w:p>
+    <w:p>
+      <w:pPr>
+        <w:pStyle w:val="BodyText"/>
+      </w:pPr>
+      <w:r>
+        <w:t xml:space="preserve">Two subject types,</w:t>
+      </w:r>
+      <w:r>
+        <w:t xml:space="preserve"> </w:t>
+      </w:r>
+      <w:r>
+        <w:rPr>
+          <w:rStyle w:val="VerbatimChar"/>
+        </w:rPr>
+        <w:t xml:space="preserve">physical_object</w:t>
+      </w:r>
+      <w:r>
+        <w:t xml:space="preserve"> </w:t>
+      </w:r>
+      <w:r>
+        <w:t xml:space="preserve">and</w:t>
+      </w:r>
+      <w:r>
+        <w:t xml:space="preserve"> </w:t>
+      </w:r>
+      <w:r>
+        <w:rPr>
+          <w:rStyle w:val="VerbatimChar"/>
+        </w:rPr>
+        <w:t xml:space="preserve">storage_location</w:t>
+      </w:r>
+      <w:r>
+        <w:t xml:space="preserve">. A location move is logged once, for the location that moved; what sat under it is a closure query, so there is no per-object fan-out. Bulk moves write one row per object sharing a</w:t>
+      </w:r>
+      <w:r>
+        <w:t xml:space="preserve"> </w:t>
+      </w:r>
+      <w:r>
+        <w:rPr>
+          <w:rStyle w:val="VerbatimChar"/>
+        </w:rPr>
+        <w:t xml:space="preserve">batch_id</w:t>
+      </w:r>
+      <w:r>
+        <w:t xml:space="preserve">, in one transaction, skipping objects already at the destination.</w:t>
+      </w:r>
+    </w:p>
+    <w:p>
+      <w:pPr>
+        <w:pStyle w:val="BodyText"/>
+      </w:pPr>
+      <w:r>
+        <w:rPr>
+          <w:bCs/>
+          <w:b/>
+        </w:rPr>
+        <w:t xml:space="preserve">NULL is load-bearing in</w:t>
+      </w:r>
+      <w:r>
+        <w:rPr>
+          <w:bCs/>
+          <w:b/>
+        </w:rPr>
+        <w:t xml:space="preserve"> </w:t>
+      </w:r>
+      <w:r>
+        <w:rPr>
+          <w:rStyle w:val="VerbatimChar"/>
+          <w:bCs/>
+          <w:b/>
+        </w:rPr>
+        <w:t xml:space="preserve">from_location_id</w:t>
+      </w:r>
+      <w:r>
+        <w:rPr>
+          <w:bCs/>
+          <w:b/>
+        </w:rPr>
+        <w:t xml:space="preserve"> </w:t>
+      </w:r>
+      <w:r>
+        <w:rPr>
+          <w:bCs/>
+          <w:b/>
+        </w:rPr>
+        <w:t xml:space="preserve">and</w:t>
+      </w:r>
+      <w:r>
+        <w:rPr>
+          <w:bCs/>
+          <w:b/>
+        </w:rPr>
+        <w:t xml:space="preserve"> </w:t>
+      </w:r>
+      <w:r>
+        <w:rPr>
+          <w:rStyle w:val="VerbatimChar"/>
+          <w:bCs/>
+          <w:b/>
+        </w:rPr>
+        <w:t xml:space="preserve">to_location_id</w:t>
+      </w:r>
+      <w:r>
+        <w:rPr>
+          <w:bCs/>
+          <w:b/>
+        </w:rPr>
+        <w:t xml:space="preserve">, and means different things per subject.</w:t>
+      </w:r>
+      <w:r>
+        <w:t xml:space="preserve"> </w:t>
+      </w:r>
+      <w:r>
+        <w:t xml:space="preserve">For an object: no</w:t>
+      </w:r>
+      <w:r>
+        <w:t xml:space="preserve"> </w:t>
+      </w:r>
+      <w:r>
+        <w:rPr>
+          <w:rStyle w:val="VerbatimChar"/>
+        </w:rPr>
+        <w:t xml:space="preserve">from</w:t>
+      </w:r>
+      <w:r>
+        <w:t xml:space="preserve"> </w:t>
+      </w:r>
+      <w:r>
+        <w:t xml:space="preserve">is a first placement, no</w:t>
+      </w:r>
+      <w:r>
+        <w:t xml:space="preserve"> </w:t>
+      </w:r>
+      <w:r>
+        <w:rPr>
+          <w:rStyle w:val="VerbatimChar"/>
+        </w:rPr>
+        <w:t xml:space="preserve">to</w:t>
+      </w:r>
+      <w:r>
+        <w:t xml:space="preserve"> </w:t>
+      </w:r>
+      <w:r>
+        <w:t xml:space="preserve">is removal from storage. For a location: the columns hold the old and new parent, and NULL is the root. This is why the foreign keys are</w:t>
+      </w:r>
+      <w:r>
+        <w:t xml:space="preserve"> </w:t>
+      </w:r>
+      <w:r>
+        <w:rPr>
+          <w:rStyle w:val="VerbatimChar"/>
+        </w:rPr>
+        <w:t xml:space="preserve">ON DELETE RESTRICT</w:t>
+      </w:r>
+      <w:r>
+        <w:t xml:space="preserve"> </w:t>
+      </w:r>
+      <w:r>
+        <w:t xml:space="preserve">and not</w:t>
+      </w:r>
+      <w:r>
+        <w:t xml:space="preserve"> </w:t>
+      </w:r>
+      <w:r>
+        <w:rPr>
+          <w:rStyle w:val="VerbatimChar"/>
+        </w:rPr>
+        <w:t xml:space="preserve">SET NULL</w:t>
+      </w:r>
+      <w:r>
+        <w:t xml:space="preserve"> </w:t>
+      </w:r>
+      <w:r>
+        <w:t xml:space="preserve">- nulling a deleted location’s id would silently turn</w:t>
+      </w:r>
+      <w:r>
+        <w:t xml:space="preserve"> </w:t>
+      </w:r>
+      <w:r>
+        <w:t xml:space="preserve">“</w:t>
+      </w:r>
+      <w:r>
+        <w:t xml:space="preserve">moved out of Room A</w:t>
+      </w:r>
+      <w:r>
+        <w:t xml:space="preserve">”</w:t>
+      </w:r>
+      <w:r>
+        <w:t xml:space="preserve"> </w:t>
+      </w:r>
+      <w:r>
+        <w:t xml:space="preserve">into</w:t>
+      </w:r>
+      <w:r>
+        <w:t xml:space="preserve"> </w:t>
+      </w:r>
+      <w:r>
+        <w:t xml:space="preserve">“</w:t>
+      </w:r>
+      <w:r>
+        <w:t xml:space="preserve">taken out of storage</w:t>
+      </w:r>
+      <w:r>
+        <w:t xml:space="preserve">”</w:t>
+      </w:r>
+      <w:r>
+        <w:t xml:space="preserve">. Each row also snapshots the subject name, both location names and the username, so history reads after a rename or a deleted account.</w:t>
+      </w:r>
+      <w:r>
+        <w:t xml:space="preserve"> </w:t>
+      </w:r>
+      <w:r>
+        <w:rPr>
+          <w:rStyle w:val="VerbatimChar"/>
+        </w:rPr>
+        <w:t xml:space="preserve">user_id</w:t>
+      </w:r>
+      <w:r>
+        <w:t xml:space="preserve"> </w:t>
+      </w:r>
+      <w:r>
+        <w:t xml:space="preserve">carries no foreign key: the record has to outlive the account.</w:t>
+      </w:r>
+    </w:p>
+    <w:p>
+      <w:pPr>
+        <w:pStyle w:val="BodyText"/>
+      </w:pPr>
+      <w:r>
+        <w:rPr>
+          <w:bCs/>
+          <w:b/>
+        </w:rPr>
+        <w:t xml:space="preserve">Invariant:</w:t>
+      </w:r>
+      <w:r>
+        <w:t xml:space="preserve"> </w:t>
+      </w:r>
+      <w:r>
+        <w:rPr>
+          <w:rStyle w:val="VerbatimChar"/>
+        </w:rPr>
+        <w:t xml:space="preserve">ahg_physical_object_location</w:t>
+      </w:r>
+      <w:r>
+        <w:t xml:space="preserve"> </w:t>
+      </w:r>
+      <w:r>
+        <w:t xml:space="preserve">always equals the latest movement per object.</w:t>
+      </w:r>
+      <w:r>
+        <w:t xml:space="preserve"> </w:t>
+      </w:r>
+      <w:r>
+        <w:rPr>
+          <w:rStyle w:val="VerbatimChar"/>
+        </w:rPr>
+        <w:t xml:space="preserve">testing/storage-movement-check.php &lt;client.cnf&gt;</w:t>
+      </w:r>
+      <w:r>
+        <w:t xml:space="preserve"> </w:t>
+      </w:r>
+      <w:r>
+        <w:t xml:space="preserve">asserts it after every step against a throwaway database;</w:t>
+      </w:r>
+      <w:r>
+        <w:t xml:space="preserve"> </w:t>
+      </w:r>
+      <w:r>
+        <w:rPr>
+          <w:rStyle w:val="VerbatimChar"/>
+        </w:rPr>
+        <w:t xml:space="preserve">testing/storage-location-closure-check.php</w:t>
+      </w:r>
+      <w:r>
+        <w:t xml:space="preserve"> </w:t>
+      </w:r>
+      <w:r>
+        <w:t xml:space="preserve">does the same for the closure against a rebuild from</w:t>
+      </w:r>
+      <w:r>
+        <w:t xml:space="preserve"> </w:t>
+      </w:r>
+      <w:r>
+        <w:rPr>
+          <w:rStyle w:val="VerbatimChar"/>
+        </w:rPr>
+        <w:t xml:space="preserve">parent_id</w:t>
+      </w:r>
+      <w:r>
+        <w:t xml:space="preserve">.</w:t>
+      </w:r>
+    </w:p>
+    <w:bookmarkEnd w:id="29"/>
+    <w:bookmarkEnd w:id="30"/>
+    <w:bookmarkStart w:id="31" w:name="standards-conventions"/>
     <w:p>
       <w:pPr>
         <w:pStyle w:val="Heading2"/>
@@ -1257,9 +2781,16 @@
         <w:t xml:space="preserve">); CSP nonce on inline scripts/styles.</w:t>
       </w:r>
     </w:p>
-    <w:bookmarkEnd w:id="29"/>
-    <w:bookmarkEnd w:id="30"/>
-    <w:sectPr/>
+    <w:bookmarkEnd w:id="31"/>
+    <w:bookmarkEnd w:id="32"/>
+    <w:sectPr>
+      <w:headerReference r:id="rId9" w:type="default"/>
+      <w:footerReference r:id="rId10" w:type="default"/>
+      <w:pgSz w:h="16838" w:w="11906"/>
+      <w:pgMar w:bottom="2200" w:footer="709" w:gutter="0" w:header="709" w:left="1361" w:right="1440" w:top="2680"/>
+      <w:cols w:space="708"/>
+      <w:docGrid w:linePitch="360"/>
+    </w:sectPr>
   </w:body>
 </w:document>
 </file>
@@ -1268,6 +2799,84 @@
 <w:comments xmlns:w="http://schemas.openxmlformats.org/wordprocessingml/2006/main" xmlns:m="http://schemas.openxmlformats.org/officeDocument/2006/math" xmlns:r="http://schemas.openxmlformats.org/officeDocument/2006/relationships" xmlns:o="urn:schemas-microsoft-com:office:office" xmlns:v="urn:schemas-microsoft-com:vml" xmlns:w10="urn:schemas-microsoft-com:office:word" xmlns:a="http://schemas.openxmlformats.org/drawingml/2006/main" xmlns:pic="http://schemas.openxmlformats.org/drawingml/2006/picture" xmlns:wp="http://schemas.openxmlformats.org/drawingml/2006/wordprocessingDrawing"/>
 </file>
 
+<file path=word/footer2.xml><?xml version="1.0" encoding="utf-8"?>
+<w:ftr xmlns:wpc="http://schemas.microsoft.com/office/word/2010/wordprocessingCanvas" xmlns:cx="http://schemas.microsoft.com/office/drawing/2014/chartex" xmlns:cx1="http://schemas.microsoft.com/office/drawing/2015/9/8/chartex" xmlns:cx2="http://schemas.microsoft.com/office/drawing/2015/10/21/chartex" xmlns:cx3="http://schemas.microsoft.com/office/drawing/2016/5/9/chartex" xmlns:cx4="http://schemas.microsoft.com/office/drawing/2016/5/10/chartex" xmlns:cx5="http://schemas.microsoft.com/office/drawing/2016/5/11/chartex" xmlns:cx6="http://schemas.microsoft.com/office/drawing/2016/5/12/chartex" xmlns:cx7="http://schemas.microsoft.com/office/drawing/2016/5/13/chartex" xmlns:cx8="http://schemas.microsoft.com/office/drawing/2016/5/14/chartex" xmlns:mc="http://schemas.openxmlformats.org/markup-compatibility/2006" xmlns:aink="http://schemas.microsoft.com/office/drawing/2016/ink" xmlns:am3d="http://schemas.microsoft.com/office/drawing/2017/model3d" xmlns:o="urn:schemas-microsoft-com:office:office" xmlns:oel="http://schemas.microsoft.com/office/2019/extlst" xmlns:r="http://schemas.openxmlformats.org/officeDocument/2006/relationships" xmlns:m="http://schemas.openxmlformats.org/officeDocument/2006/math" xmlns:v="urn:schemas-microsoft-com:vml" xmlns:wp14="http://schemas.microsoft.com/office/word/2010/wordprocessingDrawing" xmlns:wp="http://schemas.openxmlformats.org/drawingml/2006/wordprocessingDrawing" xmlns:w10="urn:schemas-microsoft-com:office:word" xmlns:w="http://schemas.openxmlformats.org/wordprocessingml/2006/main" xmlns:w14="http://schemas.microsoft.com/office/word/2010/wordml" xmlns:w15="http://schemas.microsoft.com/office/word/2012/wordml" xmlns:w16cex="http://schemas.microsoft.com/office/word/2018/wordml/cex" xmlns:w16cid="http://schemas.microsoft.com/office/word/2016/wordml/cid" xmlns:w16="http://schemas.microsoft.com/office/word/2018/wordml" xmlns:w16du="http://schemas.microsoft.com/office/word/2023/wordml/word16du" xmlns:w16sdtdh="http://schemas.microsoft.com/office/word/2020/wordml/sdtdatahash" xmlns:w16sdtfl="http://schemas.microsoft.com/office/word/2024/wordml/sdtformatlock" xmlns:w16se="http://schemas.microsoft.com/office/word/2015/wordml/symex" xmlns:wpg="http://schemas.microsoft.com/office/word/2010/wordprocessingGroup" xmlns:wpi="http://schemas.microsoft.com/office/word/2010/wordprocessingInk" xmlns:wne="http://schemas.microsoft.com/office/word/2006/wordml" xmlns:wps="http://schemas.microsoft.com/office/word/2010/wordprocessingShape" mc:Ignorable="w14 w15 w16se w16cid w16 w16cex w16sdtdh w16sdtfl w16du wp14">
+  <w:p>
+    <w:pPr>
+      <w:pStyle w:val="Footer"/>
+      <w:tabs>
+        <w:tab w:val="clear" w:pos="4513"/>
+        <w:tab w:val="clear" w:pos="9026"/>
+        <w:tab w:val="left" w:pos="3731"/>
+      </w:tabs>
+    </w:pPr>
+    <w:r>
+      <w:rPr>
+        <w:noProof/>
+      </w:rPr>
+      <w:drawing>
+        <wp:anchor distT="0" distB="0" distL="114300" distR="114300" simplePos="0" relativeHeight="251672576" behindDoc="1" locked="0" layoutInCell="1" allowOverlap="1" wp14:anchorId="61B824A6" wp14:editId="3C90FE3F">
+          <wp:simplePos x="0" y="0"/>
+          <wp:positionH relativeFrom="page">
+            <wp:align>left</wp:align>
+          </wp:positionH>
+          <wp:positionV relativeFrom="paragraph">
+            <wp:posOffset>-687573</wp:posOffset>
+          </wp:positionV>
+          <wp:extent cx="7597678" cy="1314821"/>
+          <wp:effectExtent l="0" t="0" r="3810" b="0"/>
+          <wp:wrapNone/>
+          <wp:docPr id="1703766760" name="Picture 8" descr="A black and blue rectangle with a black background&#10;&#10;AI-generated content may be incorrect."/>
+          <wp:cNvGraphicFramePr>
+            <a:graphicFrameLocks xmlns:a="http://schemas.openxmlformats.org/drawingml/2006/main" noChangeAspect="1"/>
+          </wp:cNvGraphicFramePr>
+          <a:graphic xmlns:a="http://schemas.openxmlformats.org/drawingml/2006/main">
+            <a:graphicData uri="http://schemas.openxmlformats.org/drawingml/2006/picture">
+              <pic:pic xmlns:pic="http://schemas.openxmlformats.org/drawingml/2006/picture">
+                <pic:nvPicPr>
+                  <pic:cNvPr id="1703766760" name="Picture 8" descr="A black and blue rectangle with a black background&#10;&#10;AI-generated content may be incorrect."/>
+                  <pic:cNvPicPr/>
+                </pic:nvPicPr>
+                <pic:blipFill>
+                  <a:blip r:embed="rId1">
+                    <a:extLst>
+                      <a:ext uri="{28A0092B-C50C-407E-A947-70E740481C1C}">
+                        <a14:useLocalDpi xmlns:a14="http://schemas.microsoft.com/office/drawing/2010/main" val="0"/>
+                      </a:ext>
+                    </a:extLst>
+                  </a:blip>
+                  <a:stretch>
+                    <a:fillRect/>
+                  </a:stretch>
+                </pic:blipFill>
+                <pic:spPr>
+                  <a:xfrm>
+                    <a:off x="0" y="0"/>
+                    <a:ext cx="7597678" cy="1314821"/>
+                  </a:xfrm>
+                  <a:prstGeom prst="rect">
+                    <a:avLst/>
+                  </a:prstGeom>
+                </pic:spPr>
+              </pic:pic>
+            </a:graphicData>
+          </a:graphic>
+          <wp14:sizeRelH relativeFrom="page">
+            <wp14:pctWidth>0</wp14:pctWidth>
+          </wp14:sizeRelH>
+          <wp14:sizeRelV relativeFrom="page">
+            <wp14:pctHeight>0</wp14:pctHeight>
+          </wp14:sizeRelV>
+        </wp:anchor>
+      </w:drawing>
+    </w:r>
+    <w:r>
+      <w:tab/>
+    </w:r>
+  </w:p>
+</w:ftr>
+</file>
+
 <file path=word/footnotes.xml><?xml version="1.0" encoding="utf-8"?>
 <w:footnotes xmlns:w="http://schemas.openxmlformats.org/wordprocessingml/2006/main" xmlns:m="http://schemas.openxmlformats.org/officeDocument/2006/math" xmlns:r="http://schemas.openxmlformats.org/officeDocument/2006/relationships" xmlns:o="urn:schemas-microsoft-com:office:office" xmlns:v="urn:schemas-microsoft-com:vml" xmlns:w10="urn:schemas-microsoft-com:office:word" xmlns:a="http://schemas.openxmlformats.org/drawingml/2006/main" xmlns:pic="http://schemas.openxmlformats.org/drawingml/2006/picture" xmlns:wp="http://schemas.openxmlformats.org/drawingml/2006/wordprocessingDrawing">
   <w:footnote w:type="continuationSeparator" w:id="0">
@@ -1285,6 +2894,982 @@
     </w:p>
   </w:footnote>
 </w:footnotes>
+</file>
+
+<file path=word/header2.xml><?xml version="1.0" encoding="utf-8"?>
+<w:hdr xmlns:wpc="http://schemas.microsoft.com/office/word/2010/wordprocessingCanvas" xmlns:cx="http://schemas.microsoft.com/office/drawing/2014/chartex" xmlns:cx1="http://schemas.microsoft.com/office/drawing/2015/9/8/chartex" xmlns:cx2="http://schemas.microsoft.com/office/drawing/2015/10/21/chartex" xmlns:cx3="http://schemas.microsoft.com/office/drawing/2016/5/9/chartex" xmlns:cx4="http://schemas.microsoft.com/office/drawing/2016/5/10/chartex" xmlns:cx5="http://schemas.microsoft.com/office/drawing/2016/5/11/chartex" xmlns:cx6="http://schemas.microsoft.com/office/drawing/2016/5/12/chartex" xmlns:cx7="http://schemas.microsoft.com/office/drawing/2016/5/13/chartex" xmlns:cx8="http://schemas.microsoft.com/office/drawing/2016/5/14/chartex" xmlns:mc="http://schemas.openxmlformats.org/markup-compatibility/2006" xmlns:aink="http://schemas.microsoft.com/office/drawing/2016/ink" xmlns:am3d="http://schemas.microsoft.com/office/drawing/2017/model3d" xmlns:o="urn:schemas-microsoft-com:office:office" xmlns:oel="http://schemas.microsoft.com/office/2019/extlst" xmlns:r="http://schemas.openxmlformats.org/officeDocument/2006/relationships" xmlns:m="http://schemas.openxmlformats.org/officeDocument/2006/math" xmlns:v="urn:schemas-microsoft-com:vml" xmlns:wp14="http://schemas.microsoft.com/office/word/2010/wordprocessingDrawing" xmlns:wp="http://schemas.openxmlformats.org/drawingml/2006/wordprocessingDrawing" xmlns:w10="urn:schemas-microsoft-com:office:word" xmlns:w="http://schemas.openxmlformats.org/wordprocessingml/2006/main" xmlns:w14="http://schemas.microsoft.com/office/word/2010/wordml" xmlns:w15="http://schemas.microsoft.com/office/word/2012/wordml" xmlns:w16cex="http://schemas.microsoft.com/office/word/2018/wordml/cex" xmlns:w16cid="http://schemas.microsoft.com/office/word/2016/wordml/cid" xmlns:w16="http://schemas.microsoft.com/office/word/2018/wordml" xmlns:w16du="http://schemas.microsoft.com/office/word/2023/wordml/word16du" xmlns:w16sdtdh="http://schemas.microsoft.com/office/word/2020/wordml/sdtdatahash" xmlns:w16sdtfl="http://schemas.microsoft.com/office/word/2024/wordml/sdtformatlock" xmlns:w16se="http://schemas.microsoft.com/office/word/2015/wordml/symex" xmlns:wpg="http://schemas.microsoft.com/office/word/2010/wordprocessingGroup" xmlns:wpi="http://schemas.microsoft.com/office/word/2010/wordprocessingInk" xmlns:wne="http://schemas.microsoft.com/office/word/2006/wordml" xmlns:wps="http://schemas.microsoft.com/office/word/2010/wordprocessingShape" mc:Ignorable="w14 w15 w16se w16cid w16 w16cex w16sdtdh w16sdtfl w16du wp14">
+  <w:p>
+    <w:pPr>
+      <w:pStyle w:val="Header"/>
+    </w:pPr>
+    <w:r>
+      <w:rPr>
+        <w:noProof/>
+      </w:rPr>
+      <mc:AlternateContent>
+        <mc:Choice Requires="wps">
+          <w:drawing>
+            <wp:anchor distT="0" distB="0" distL="114300" distR="114300" simplePos="0" relativeHeight="251664384" behindDoc="0" locked="0" layoutInCell="1" allowOverlap="1" wp14:anchorId="0A6C3590" wp14:editId="15787B4A">
+              <wp:simplePos x="0" y="0"/>
+              <wp:positionH relativeFrom="column">
+                <wp:posOffset>3907790</wp:posOffset>
+              </wp:positionH>
+              <wp:positionV relativeFrom="paragraph">
+                <wp:posOffset>38579</wp:posOffset>
+              </wp:positionV>
+              <wp:extent cx="1625600" cy="527050"/>
+              <wp:effectExtent l="0" t="0" r="0" b="6350"/>
+              <wp:wrapNone/>
+              <wp:docPr id="812939645" name="Text Box 5"/>
+              <wp:cNvGraphicFramePr/>
+              <a:graphic xmlns:a="http://schemas.openxmlformats.org/drawingml/2006/main">
+                <a:graphicData uri="http://schemas.microsoft.com/office/word/2010/wordprocessingShape">
+                  <wps:wsp>
+                    <wps:cNvSpPr txBox="1"/>
+                    <wps:spPr>
+                      <a:xfrm>
+                        <a:off x="0" y="0"/>
+                        <a:ext cx="1625600" cy="527050"/>
+                      </a:xfrm>
+                      <a:prstGeom prst="rect">
+                        <a:avLst/>
+                      </a:prstGeom>
+                      <a:noFill/>
+                      <a:ln w="6350">
+                        <a:noFill/>
+                      </a:ln>
+                    </wps:spPr>
+                    <wps:txbx>
+                      <w:txbxContent>
+                        <w:p>
+                          <w:pPr>
+                            <w:spacing w:line="192" w:lineRule="auto"/>
+                            <w:rPr>
+                              <w:rFonts w:ascii="Noto Sans" w:hAnsi="Noto Sans" w:cs="Noto Sans"/>
+                              <w:color w:val="10373E"/>
+                              <w:sz w:val="16"/>
+                              <w:szCs w:val="16"/>
+                            </w:rPr>
+                          </w:pPr>
+                          <w:r>
+                            <w:rPr>
+                              <w:rFonts w:ascii="Noto Sans" w:hAnsi="Noto Sans" w:cs="Noto Sans"/>
+                              <w:color w:val="10373E"/>
+                              <w:sz w:val="16"/>
+                              <w:szCs w:val="16"/>
+                            </w:rPr>
+                            <w:t>490 Barry Hertzog Street</w:t>
+                          </w:r>
+                          <w:r>
+                            <w:rPr>
+                              <w:rFonts w:ascii="MS Gothic" w:eastAsia="MS Gothic" w:hAnsi="MS Gothic" w:cs="MS Gothic" w:hint="eastAsia"/>
+                              <w:color w:val="10373E"/>
+                              <w:sz w:val="16"/>
+                              <w:szCs w:val="16"/>
+                            </w:rPr>
+                            <w:t> +</w:t>
+                          </w:r>
+                          <w:r>
+                            <w:rPr>
+                              <w:rFonts w:ascii="Noto Sans" w:hAnsi="Noto Sans" w:cs="Noto Sans"/>
+                              <w:color w:val="10373E"/>
+                              <w:sz w:val="16"/>
+                              <w:szCs w:val="16"/>
+                            </w:rPr>
+                            <w:t xml:space="preserve">Constantia Park </w:t>
+                          </w:r>
+                          <w:r>
+                            <w:rPr>
+                              <w:rFonts w:ascii="Noto Sans" w:hAnsi="Noto Sans" w:cs="Noto Sans"/>
+                              <w:color w:val="10373E"/>
+                              <w:sz w:val="16"/>
+                              <w:szCs w:val="16"/>
+                            </w:rPr>
+                            <w:br/>
+                          </w:r>
+                          <w:r>
+                            <w:rPr>
+                              <w:rFonts w:ascii="Noto Sans" w:hAnsi="Noto Sans" w:cs="Noto Sans"/>
+                              <w:color w:val="10373E"/>
+                              <w:sz w:val="16"/>
+                              <w:szCs w:val="16"/>
+                            </w:rPr>
+                            <w:t>Pretoria 0181</w:t>
+                          </w:r>
+                        </w:p>
+                      </w:txbxContent>
+                    </wps:txbx>
+                    <wps:bodyPr rot="0" spcFirstLastPara="0" vertOverflow="overflow" horzOverflow="overflow" vert="horz" wrap="square" lIns="91440" tIns="45720" rIns="91440" bIns="45720" numCol="1" spcCol="0" rtlCol="0" fromWordArt="0" anchor="t" anchorCtr="0" forceAA="0" compatLnSpc="1">
+                      <a:prstTxWarp prst="textNoShape">
+                        <a:avLst/>
+                      </a:prstTxWarp>
+                      <a:noAutofit/>
+                    </wps:bodyPr>
+                  </wps:wsp>
+                </a:graphicData>
+              </a:graphic>
+              <wp14:sizeRelH relativeFrom="margin">
+                <wp14:pctWidth>0</wp14:pctWidth>
+              </wp14:sizeRelH>
+              <wp14:sizeRelV relativeFrom="margin">
+                <wp14:pctHeight>0</wp14:pctHeight>
+              </wp14:sizeRelV>
+            </wp:anchor>
+          </w:drawing>
+        </mc:Choice>
+        <mc:Fallback>
+          <w:pict>
+            <v:shapetype w14:anchorId="0A6C3590" id="_x0000_t202" coordsize="21600,21600" o:spt="202" path="m,l,21600r21600,l21600,xe">
+              <v:stroke joinstyle="miter"/>
+              <v:path gradientshapeok="t" o:connecttype="rect"/>
+            </v:shapetype>
+            <v:shape id="Text Box 5" o:spid="_x0000_s1026" type="#_x0000_t202" style="position:absolute;margin-left:307.7pt;margin-top:3.05pt;width:128pt;height:41.5pt;z-index:251664384;visibility:visible;mso-wrap-style:square;mso-width-percent:0;mso-height-percent:0;mso-wrap-distance-left:9pt;mso-wrap-distance-top:0;mso-wrap-distance-right:9pt;mso-wrap-distance-bottom:0;mso-position-horizontal:absolute;mso-position-horizontal-relative:text;mso-position-vertical:absolute;mso-position-vertical-relative:text;mso-width-percent:0;mso-height-percent:0;mso-width-relative:margin;mso-height-relative:margin;v-text-anchor:top" o:gfxdata="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" filled="f" stroked="f" strokeweight=".5pt">
+              <v:textbox>
+                <w:txbxContent>
+                  <w:p>
+                    <w:pPr>
+                      <w:spacing w:line="192" w:lineRule="auto"/>
+                      <w:rPr>
+                        <w:rFonts w:ascii="Noto Sans" w:hAnsi="Noto Sans" w:cs="Noto Sans"/>
+                        <w:color w:val="10373E"/>
+                        <w:sz w:val="16"/>
+                        <w:szCs w:val="16"/>
+                      </w:rPr>
+                    </w:pPr>
+                    <w:r>
+                      <w:rPr>
+                        <w:rFonts w:ascii="Noto Sans" w:hAnsi="Noto Sans" w:cs="Noto Sans"/>
+                        <w:color w:val="10373E"/>
+                        <w:sz w:val="16"/>
+                        <w:szCs w:val="16"/>
+                      </w:rPr>
+                      <w:t>490 Barry Hertzog Street</w:t>
+                    </w:r>
+                    <w:r>
+                      <w:rPr>
+                        <w:rFonts w:ascii="MS Gothic" w:eastAsia="MS Gothic" w:hAnsi="MS Gothic" w:cs="MS Gothic" w:hint="eastAsia"/>
+                        <w:color w:val="10373E"/>
+                        <w:sz w:val="16"/>
+                        <w:szCs w:val="16"/>
+                      </w:rPr>
+                      <w:t> +</w:t>
+                    </w:r>
+                    <w:r>
+                      <w:rPr>
+                        <w:rFonts w:ascii="Noto Sans" w:hAnsi="Noto Sans" w:cs="Noto Sans"/>
+                        <w:color w:val="10373E"/>
+                        <w:sz w:val="16"/>
+                        <w:szCs w:val="16"/>
+                      </w:rPr>
+                      <w:t xml:space="preserve">Constantia Park </w:t>
+                    </w:r>
+                    <w:r>
+                      <w:rPr>
+                        <w:rFonts w:ascii="Noto Sans" w:hAnsi="Noto Sans" w:cs="Noto Sans"/>
+                        <w:color w:val="10373E"/>
+                        <w:sz w:val="16"/>
+                        <w:szCs w:val="16"/>
+                      </w:rPr>
+                      <w:br/>
+                    </w:r>
+                    <w:r>
+                      <w:rPr>
+                        <w:rFonts w:ascii="Noto Sans" w:hAnsi="Noto Sans" w:cs="Noto Sans"/>
+                        <w:color w:val="10373E"/>
+                        <w:sz w:val="16"/>
+                        <w:szCs w:val="16"/>
+                      </w:rPr>
+                      <w:t>Pretoria 0181</w:t>
+                    </w:r>
+                  </w:p>
+                </w:txbxContent>
+              </v:textbox>
+            </v:shape>
+          </w:pict>
+        </mc:Fallback>
+      </mc:AlternateContent>
+    </w:r>
+    <w:r>
+      <w:rPr>
+        <w:noProof/>
+      </w:rPr>
+      <w:drawing>
+        <wp:anchor distT="0" distB="0" distL="114300" distR="114300" simplePos="0" relativeHeight="251670528" behindDoc="1" locked="0" layoutInCell="1" allowOverlap="1" wp14:anchorId="05DDA482" wp14:editId="6B6E429E">
+          <wp:simplePos x="0" y="0"/>
+          <wp:positionH relativeFrom="page">
+            <wp:posOffset>0</wp:posOffset>
+          </wp:positionH>
+          <wp:positionV relativeFrom="paragraph">
+            <wp:posOffset>-457464</wp:posOffset>
+          </wp:positionV>
+          <wp:extent cx="7566766" cy="1144322"/>
+          <wp:effectExtent l="0" t="0" r="0" b="0"/>
+          <wp:wrapNone/>
+          <wp:docPr id="138615095" name="Picture 7" descr="A white rectangular object with black text&#10;&#10;AI-generated content may be incorrect."/>
+          <wp:cNvGraphicFramePr>
+            <a:graphicFrameLocks xmlns:a="http://schemas.openxmlformats.org/drawingml/2006/main" noChangeAspect="1"/>
+          </wp:cNvGraphicFramePr>
+          <a:graphic xmlns:a="http://schemas.openxmlformats.org/drawingml/2006/main">
+            <a:graphicData uri="http://schemas.openxmlformats.org/drawingml/2006/picture">
+              <pic:pic xmlns:pic="http://schemas.openxmlformats.org/drawingml/2006/picture">
+                <pic:nvPicPr>
+                  <pic:cNvPr id="138615095" name="Picture 7" descr="A white rectangular object with black text&#10;&#10;AI-generated content may be incorrect."/>
+                  <pic:cNvPicPr/>
+                </pic:nvPicPr>
+                <pic:blipFill>
+                  <a:blip r:embed="rId1">
+                    <a:extLst>
+                      <a:ext uri="{28A0092B-C50C-407E-A947-70E740481C1C}">
+                        <a14:useLocalDpi xmlns:a14="http://schemas.microsoft.com/office/drawing/2010/main" val="0"/>
+                      </a:ext>
+                    </a:extLst>
+                  </a:blip>
+                  <a:stretch>
+                    <a:fillRect/>
+                  </a:stretch>
+                </pic:blipFill>
+                <pic:spPr>
+                  <a:xfrm>
+                    <a:off x="0" y="0"/>
+                    <a:ext cx="7566766" cy="1144322"/>
+                  </a:xfrm>
+                  <a:prstGeom prst="rect">
+                    <a:avLst/>
+                  </a:prstGeom>
+                </pic:spPr>
+              </pic:pic>
+            </a:graphicData>
+          </a:graphic>
+          <wp14:sizeRelH relativeFrom="page">
+            <wp14:pctWidth>0</wp14:pctWidth>
+          </wp14:sizeRelH>
+          <wp14:sizeRelV relativeFrom="page">
+            <wp14:pctHeight>0</wp14:pctHeight>
+          </wp14:sizeRelV>
+        </wp:anchor>
+      </w:drawing>
+    </w:r>
+    <w:r>
+      <w:rPr>
+        <w:noProof/>
+      </w:rPr>
+      <mc:AlternateContent>
+        <mc:Choice Requires="wps">
+          <w:drawing>
+            <wp:anchor distT="0" distB="0" distL="114300" distR="114300" simplePos="0" relativeHeight="251668480" behindDoc="0" locked="0" layoutInCell="1" allowOverlap="1" wp14:anchorId="62B8B08E" wp14:editId="017DF92B">
+              <wp:simplePos x="0" y="0"/>
+              <wp:positionH relativeFrom="page">
+                <wp:posOffset>6332855</wp:posOffset>
+              </wp:positionH>
+              <wp:positionV relativeFrom="paragraph">
+                <wp:posOffset>114935</wp:posOffset>
+              </wp:positionV>
+              <wp:extent cx="1181100" cy="381000"/>
+              <wp:effectExtent l="0" t="0" r="0" b="0"/>
+              <wp:wrapNone/>
+              <wp:docPr id="427271905" name="Text Box 5"/>
+              <wp:cNvGraphicFramePr/>
+              <a:graphic xmlns:a="http://schemas.openxmlformats.org/drawingml/2006/main">
+                <a:graphicData uri="http://schemas.microsoft.com/office/word/2010/wordprocessingShape">
+                  <wps:wsp>
+                    <wps:cNvSpPr txBox="1"/>
+                    <wps:spPr>
+                      <a:xfrm>
+                        <a:off x="0" y="0"/>
+                        <a:ext cx="1181100" cy="381000"/>
+                      </a:xfrm>
+                      <a:prstGeom prst="rect">
+                        <a:avLst/>
+                      </a:prstGeom>
+                      <a:noFill/>
+                      <a:ln w="6350">
+                        <a:noFill/>
+                      </a:ln>
+                    </wps:spPr>
+                    <wps:txbx>
+                      <w:txbxContent>
+                        <w:p>
+                          <w:pPr>
+                            <w:spacing w:line="192" w:lineRule="auto"/>
+                            <w:rPr>
+                              <w:rFonts w:ascii="Noto Sans" w:hAnsi="Noto Sans" w:cs="Noto Sans"/>
+                              <w:color w:val="10373E"/>
+                              <w:sz w:val="16"/>
+                              <w:szCs w:val="16"/>
+                            </w:rPr>
+                          </w:pPr>
+                          <w:r>
+                            <w:rPr>
+                              <w:rFonts w:ascii="Noto Sans" w:hAnsi="Noto Sans" w:cs="Noto Sans"/>
+                              <w:color w:val="653332"/>
+                              <w:sz w:val="16"/>
+                              <w:szCs w:val="16"/>
+                            </w:rPr>
+                            <w:t>Reg No:</w:t>
+                          </w:r>
+                          <w:r>
+                            <w:rPr>
+                              <w:rFonts w:ascii="Noto Sans" w:hAnsi="Noto Sans" w:cs="Noto Sans"/>
+                              <w:color w:val="653332"/>
+                              <w:sz w:val="16"/>
+                              <w:szCs w:val="16"/>
+                            </w:rPr>
+                            <w:br/>
+                          </w:r>
+                          <w:r>
+                            <w:rPr>
+                              <w:rFonts w:ascii="Noto Sans" w:hAnsi="Noto Sans" w:cs="Noto Sans"/>
+                              <w:color w:val="10373E"/>
+                              <w:sz w:val="16"/>
+                              <w:szCs w:val="16"/>
+                            </w:rPr>
+                            <w:t>2024 / 316608 / 07</w:t>
+                          </w:r>
+                        </w:p>
+                      </w:txbxContent>
+                    </wps:txbx>
+                    <wps:bodyPr rot="0" spcFirstLastPara="0" vertOverflow="overflow" horzOverflow="overflow" vert="horz" wrap="square" lIns="91440" tIns="45720" rIns="91440" bIns="45720" numCol="1" spcCol="0" rtlCol="0" fromWordArt="0" anchor="t" anchorCtr="0" forceAA="0" compatLnSpc="1">
+                      <a:prstTxWarp prst="textNoShape">
+                        <a:avLst/>
+                      </a:prstTxWarp>
+                      <a:noAutofit/>
+                    </wps:bodyPr>
+                  </wps:wsp>
+                </a:graphicData>
+              </a:graphic>
+              <wp14:sizeRelH relativeFrom="margin">
+                <wp14:pctWidth>0</wp14:pctWidth>
+              </wp14:sizeRelH>
+              <wp14:sizeRelV relativeFrom="margin">
+                <wp14:pctHeight>0</wp14:pctHeight>
+              </wp14:sizeRelV>
+            </wp:anchor>
+          </w:drawing>
+        </mc:Choice>
+        <mc:Fallback>
+          <w:pict>
+            <v:shape w14:anchorId="62B8B08E" id="_x0000_s1027" type="#_x0000_t202" style="position:absolute;margin-left:498.65pt;margin-top:9.05pt;width:93pt;height:30pt;z-index:251668480;visibility:visible;mso-wrap-style:square;mso-width-percent:0;mso-height-percent:0;mso-wrap-distance-left:9pt;mso-wrap-distance-top:0;mso-wrap-distance-right:9pt;mso-wrap-distance-bottom:0;mso-position-horizontal:absolute;mso-position-horizontal-relative:page;mso-position-vertical:absolute;mso-position-vertical-relative:text;mso-width-percent:0;mso-height-percent:0;mso-width-relative:margin;mso-height-relative:margin;v-text-anchor:top" o:gfxdata="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" filled="f" stroked="f" strokeweight=".5pt">
+              <v:textbox>
+                <w:txbxContent>
+                  <w:p>
+                    <w:pPr>
+                      <w:spacing w:line="192" w:lineRule="auto"/>
+                      <w:rPr>
+                        <w:rFonts w:ascii="Noto Sans" w:hAnsi="Noto Sans" w:cs="Noto Sans"/>
+                        <w:color w:val="10373E"/>
+                        <w:sz w:val="16"/>
+                        <w:szCs w:val="16"/>
+                      </w:rPr>
+                    </w:pPr>
+                    <w:r>
+                      <w:rPr>
+                        <w:rFonts w:ascii="Noto Sans" w:hAnsi="Noto Sans" w:cs="Noto Sans"/>
+                        <w:color w:val="653332"/>
+                        <w:sz w:val="16"/>
+                        <w:szCs w:val="16"/>
+                      </w:rPr>
+                      <w:t>Reg No:</w:t>
+                    </w:r>
+                    <w:r>
+                      <w:rPr>
+                        <w:rFonts w:ascii="Noto Sans" w:hAnsi="Noto Sans" w:cs="Noto Sans"/>
+                        <w:color w:val="653332"/>
+                        <w:sz w:val="16"/>
+                        <w:szCs w:val="16"/>
+                      </w:rPr>
+                      <w:br/>
+                    </w:r>
+                    <w:r>
+                      <w:rPr>
+                        <w:rFonts w:ascii="Noto Sans" w:hAnsi="Noto Sans" w:cs="Noto Sans"/>
+                        <w:color w:val="10373E"/>
+                        <w:sz w:val="16"/>
+                        <w:szCs w:val="16"/>
+                      </w:rPr>
+                      <w:t>2024 / 316608 / 07</w:t>
+                    </w:r>
+                  </w:p>
+                </w:txbxContent>
+              </v:textbox>
+              <w10:wrap anchorx="page"/>
+            </v:shape>
+          </w:pict>
+        </mc:Fallback>
+      </mc:AlternateContent>
+    </w:r>
+    <w:r>
+      <w:rPr>
+        <w:noProof/>
+      </w:rPr>
+      <mc:AlternateContent>
+        <mc:Choice Requires="wps">
+          <w:drawing>
+            <wp:anchor distT="0" distB="0" distL="114300" distR="114300" simplePos="0" relativeHeight="251666432" behindDoc="0" locked="0" layoutInCell="1" allowOverlap="1" wp14:anchorId="7B2099E7" wp14:editId="6C42685A">
+              <wp:simplePos x="0" y="0"/>
+              <wp:positionH relativeFrom="column">
+                <wp:posOffset>5469989</wp:posOffset>
+              </wp:positionH>
+              <wp:positionV relativeFrom="paragraph">
+                <wp:posOffset>-196215</wp:posOffset>
+              </wp:positionV>
+              <wp:extent cx="1181100" cy="381000"/>
+              <wp:effectExtent l="0" t="0" r="0" b="0"/>
+              <wp:wrapNone/>
+              <wp:docPr id="1099339089" name="Text Box 5"/>
+              <wp:cNvGraphicFramePr/>
+              <a:graphic xmlns:a="http://schemas.openxmlformats.org/drawingml/2006/main">
+                <a:graphicData uri="http://schemas.microsoft.com/office/word/2010/wordprocessingShape">
+                  <wps:wsp>
+                    <wps:cNvSpPr txBox="1"/>
+                    <wps:spPr>
+                      <a:xfrm>
+                        <a:off x="0" y="0"/>
+                        <a:ext cx="1181100" cy="381000"/>
+                      </a:xfrm>
+                      <a:prstGeom prst="rect">
+                        <a:avLst/>
+                      </a:prstGeom>
+                      <a:noFill/>
+                      <a:ln w="6350">
+                        <a:noFill/>
+                      </a:ln>
+                    </wps:spPr>
+                    <wps:txbx>
+                      <w:txbxContent>
+                        <w:p>
+                          <w:pPr>
+                            <w:spacing w:line="180" w:lineRule="auto"/>
+                            <w:rPr>
+                              <w:rFonts w:ascii="Noto Sans" w:hAnsi="Noto Sans" w:cs="Noto Sans"/>
+                              <w:color w:val="10373E"/>
+                              <w:sz w:val="16"/>
+                              <w:szCs w:val="16"/>
+                            </w:rPr>
+                          </w:pPr>
+                          <w:r>
+                            <w:rPr>
+                              <w:rFonts w:ascii="Noto Sans" w:hAnsi="Noto Sans" w:cs="Noto Sans"/>
+                              <w:color w:val="653332"/>
+                              <w:sz w:val="16"/>
+                              <w:szCs w:val="16"/>
+                            </w:rPr>
+                            <w:t>VAT:</w:t>
+                          </w:r>
+                          <w:r>
+                            <w:rPr>
+                              <w:rFonts w:ascii="Noto Sans" w:hAnsi="Noto Sans" w:cs="Noto Sans"/>
+                              <w:color w:val="653332"/>
+                              <w:sz w:val="16"/>
+                              <w:szCs w:val="16"/>
+                            </w:rPr>
+                            <w:br/>
+                          </w:r>
+                          <w:r>
+                            <w:rPr>
+                              <w:rFonts w:ascii="Noto Sans" w:hAnsi="Noto Sans" w:cs="Noto Sans"/>
+                              <w:color w:val="10373E"/>
+                              <w:sz w:val="16"/>
+                              <w:szCs w:val="16"/>
+                            </w:rPr>
+                            <w:t>4010321919</w:t>
+                          </w:r>
+                        </w:p>
+                      </w:txbxContent>
+                    </wps:txbx>
+                    <wps:bodyPr rot="0" spcFirstLastPara="0" vertOverflow="overflow" horzOverflow="overflow" vert="horz" wrap="square" lIns="91440" tIns="45720" rIns="91440" bIns="45720" numCol="1" spcCol="0" rtlCol="0" fromWordArt="0" anchor="t" anchorCtr="0" forceAA="0" compatLnSpc="1">
+                      <a:prstTxWarp prst="textNoShape">
+                        <a:avLst/>
+                      </a:prstTxWarp>
+                      <a:noAutofit/>
+                    </wps:bodyPr>
+                  </wps:wsp>
+                </a:graphicData>
+              </a:graphic>
+              <wp14:sizeRelH relativeFrom="margin">
+                <wp14:pctWidth>0</wp14:pctWidth>
+              </wp14:sizeRelH>
+              <wp14:sizeRelV relativeFrom="margin">
+                <wp14:pctHeight>0</wp14:pctHeight>
+              </wp14:sizeRelV>
+            </wp:anchor>
+          </w:drawing>
+        </mc:Choice>
+        <mc:Fallback>
+          <w:pict>
+            <v:shape w14:anchorId="7B2099E7" id="_x0000_s1028" type="#_x0000_t202" style="position:absolute;margin-left:430.7pt;margin-top:-15.45pt;width:93pt;height:30pt;z-index:251666432;visibility:visible;mso-wrap-style:square;mso-width-percent:0;mso-height-percent:0;mso-wrap-distance-left:9pt;mso-wrap-distance-top:0;mso-wrap-distance-right:9pt;mso-wrap-distance-bottom:0;mso-position-horizontal:absolute;mso-position-horizontal-relative:text;mso-position-vertical:absolute;mso-position-vertical-relative:text;mso-width-percent:0;mso-height-percent:0;mso-width-relative:margin;mso-height-relative:margin;v-text-anchor:top" o:gfxdata="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" filled="f" stroked="f" strokeweight=".5pt">
+              <v:textbox>
+                <w:txbxContent>
+                  <w:p>
+                    <w:pPr>
+                      <w:spacing w:line="180" w:lineRule="auto"/>
+                      <w:rPr>
+                        <w:rFonts w:ascii="Noto Sans" w:hAnsi="Noto Sans" w:cs="Noto Sans"/>
+                        <w:color w:val="10373E"/>
+                        <w:sz w:val="16"/>
+                        <w:szCs w:val="16"/>
+                      </w:rPr>
+                    </w:pPr>
+                    <w:r>
+                      <w:rPr>
+                        <w:rFonts w:ascii="Noto Sans" w:hAnsi="Noto Sans" w:cs="Noto Sans"/>
+                        <w:color w:val="653332"/>
+                        <w:sz w:val="16"/>
+                        <w:szCs w:val="16"/>
+                      </w:rPr>
+                      <w:t>VAT:</w:t>
+                    </w:r>
+                    <w:r>
+                      <w:rPr>
+                        <w:rFonts w:ascii="Noto Sans" w:hAnsi="Noto Sans" w:cs="Noto Sans"/>
+                        <w:color w:val="653332"/>
+                        <w:sz w:val="16"/>
+                        <w:szCs w:val="16"/>
+                      </w:rPr>
+                      <w:br/>
+                    </w:r>
+                    <w:r>
+                      <w:rPr>
+                        <w:rFonts w:ascii="Noto Sans" w:hAnsi="Noto Sans" w:cs="Noto Sans"/>
+                        <w:color w:val="10373E"/>
+                        <w:sz w:val="16"/>
+                        <w:szCs w:val="16"/>
+                      </w:rPr>
+                      <w:t>4010321919</w:t>
+                    </w:r>
+                  </w:p>
+                </w:txbxContent>
+              </v:textbox>
+            </v:shape>
+          </w:pict>
+        </mc:Fallback>
+      </mc:AlternateContent>
+    </w:r>
+    <w:r>
+      <w:rPr>
+        <w:noProof/>
+      </w:rPr>
+      <mc:AlternateContent>
+        <mc:Choice Requires="wps">
+          <w:drawing>
+            <wp:anchor distT="0" distB="0" distL="114300" distR="114300" simplePos="0" relativeHeight="251658240" behindDoc="0" locked="0" layoutInCell="1" allowOverlap="1" wp14:anchorId="392E9CD8" wp14:editId="2FFF53C2">
+              <wp:simplePos x="0" y="0"/>
+              <wp:positionH relativeFrom="column">
+                <wp:posOffset>2543175</wp:posOffset>
+              </wp:positionH>
+              <wp:positionV relativeFrom="paragraph">
+                <wp:posOffset>-196215</wp:posOffset>
+              </wp:positionV>
+              <wp:extent cx="1167765" cy="254000"/>
+              <wp:effectExtent l="0" t="0" r="0" b="0"/>
+              <wp:wrapNone/>
+              <wp:docPr id="338007912" name="Text Box 5"/>
+              <wp:cNvGraphicFramePr/>
+              <a:graphic xmlns:a="http://schemas.openxmlformats.org/drawingml/2006/main">
+                <a:graphicData uri="http://schemas.microsoft.com/office/word/2010/wordprocessingShape">
+                  <wps:wsp>
+                    <wps:cNvSpPr txBox="1"/>
+                    <wps:spPr>
+                      <a:xfrm>
+                        <a:off x="0" y="0"/>
+                        <a:ext cx="1167765" cy="254000"/>
+                      </a:xfrm>
+                      <a:prstGeom prst="rect">
+                        <a:avLst/>
+                      </a:prstGeom>
+                      <a:noFill/>
+                      <a:ln w="6350">
+                        <a:noFill/>
+                      </a:ln>
+                    </wps:spPr>
+                    <wps:txbx>
+                      <w:txbxContent>
+                        <w:p>
+                          <w:pPr>
+                            <w:rPr>
+                              <w:rFonts w:ascii="Noto Sans" w:hAnsi="Noto Sans" w:cs="Noto Sans"/>
+                              <w:color w:val="10373E"/>
+                              <w:sz w:val="16"/>
+                              <w:szCs w:val="16"/>
+                            </w:rPr>
+                          </w:pPr>
+                          <w:r>
+                            <w:rPr>
+                              <w:rFonts w:ascii="Noto Sans" w:hAnsi="Noto Sans" w:cs="Noto Sans"/>
+                              <w:color w:val="10373E"/>
+                              <w:sz w:val="16"/>
+                              <w:szCs w:val="16"/>
+                            </w:rPr>
+                            <w:t>johan@theahg.co.za</w:t>
+                          </w:r>
+                        </w:p>
+                      </w:txbxContent>
+                    </wps:txbx>
+                    <wps:bodyPr rot="0" spcFirstLastPara="0" vertOverflow="overflow" horzOverflow="overflow" vert="horz" wrap="square" lIns="91440" tIns="45720" rIns="91440" bIns="45720" numCol="1" spcCol="0" rtlCol="0" fromWordArt="0" anchor="t" anchorCtr="0" forceAA="0" compatLnSpc="1">
+                      <a:prstTxWarp prst="textNoShape">
+                        <a:avLst/>
+                      </a:prstTxWarp>
+                      <a:noAutofit/>
+                    </wps:bodyPr>
+                  </wps:wsp>
+                </a:graphicData>
+              </a:graphic>
+              <wp14:sizeRelH relativeFrom="margin">
+                <wp14:pctWidth>0</wp14:pctWidth>
+              </wp14:sizeRelH>
+              <wp14:sizeRelV relativeFrom="margin">
+                <wp14:pctHeight>0</wp14:pctHeight>
+              </wp14:sizeRelV>
+            </wp:anchor>
+          </w:drawing>
+        </mc:Choice>
+        <mc:Fallback>
+          <w:pict>
+            <v:shape w14:anchorId="392E9CD8" id="_x0000_s1029" type="#_x0000_t202" style="position:absolute;margin-left:200.25pt;margin-top:-15.45pt;width:91.95pt;height:20pt;z-index:251658240;visibility:visible;mso-wrap-style:square;mso-width-percent:0;mso-height-percent:0;mso-wrap-distance-left:9pt;mso-wrap-distance-top:0;mso-wrap-distance-right:9pt;mso-wrap-distance-bottom:0;mso-position-horizontal:absolute;mso-position-horizontal-relative:text;mso-position-vertical:absolute;mso-position-vertical-relative:text;mso-width-percent:0;mso-height-percent:0;mso-width-relative:margin;mso-height-relative:margin;v-text-anchor:top" o:gfxdata="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" filled="f" stroked="f" strokeweight=".5pt">
+              <v:textbox>
+                <w:txbxContent>
+                  <w:p>
+                    <w:pPr>
+                      <w:rPr>
+                        <w:rFonts w:ascii="Noto Sans" w:hAnsi="Noto Sans" w:cs="Noto Sans"/>
+                        <w:color w:val="10373E"/>
+                        <w:sz w:val="16"/>
+                        <w:szCs w:val="16"/>
+                      </w:rPr>
+                    </w:pPr>
+                    <w:r>
+                      <w:rPr>
+                        <w:rFonts w:ascii="Noto Sans" w:hAnsi="Noto Sans" w:cs="Noto Sans"/>
+                        <w:color w:val="10373E"/>
+                        <w:sz w:val="16"/>
+                        <w:szCs w:val="16"/>
+                      </w:rPr>
+                      <w:t>johan@theahg.co.za</w:t>
+                    </w:r>
+                  </w:p>
+                </w:txbxContent>
+              </v:textbox>
+            </v:shape>
+          </w:pict>
+        </mc:Fallback>
+      </mc:AlternateContent>
+    </w:r>
+    <w:r>
+      <w:rPr>
+        <w:noProof/>
+      </w:rPr>
+      <mc:AlternateContent>
+        <mc:Choice Requires="wps">
+          <w:drawing>
+            <wp:anchor distT="0" distB="0" distL="114300" distR="114300" simplePos="0" relativeHeight="251660288" behindDoc="0" locked="0" layoutInCell="1" allowOverlap="1" wp14:anchorId="6B6A3860" wp14:editId="2EB561BE">
+              <wp:simplePos x="0" y="0"/>
+              <wp:positionH relativeFrom="column">
+                <wp:posOffset>2541270</wp:posOffset>
+              </wp:positionH>
+              <wp:positionV relativeFrom="paragraph">
+                <wp:posOffset>133985</wp:posOffset>
+              </wp:positionV>
+              <wp:extent cx="1167765" cy="271145"/>
+              <wp:effectExtent l="0" t="0" r="0" b="0"/>
+              <wp:wrapNone/>
+              <wp:docPr id="1124736102" name="Text Box 5"/>
+              <wp:cNvGraphicFramePr/>
+              <a:graphic xmlns:a="http://schemas.openxmlformats.org/drawingml/2006/main">
+                <a:graphicData uri="http://schemas.microsoft.com/office/word/2010/wordprocessingShape">
+                  <wps:wsp>
+                    <wps:cNvSpPr txBox="1"/>
+                    <wps:spPr>
+                      <a:xfrm>
+                        <a:off x="0" y="0"/>
+                        <a:ext cx="1167765" cy="271145"/>
+                      </a:xfrm>
+                      <a:prstGeom prst="rect">
+                        <a:avLst/>
+                      </a:prstGeom>
+                      <a:noFill/>
+                      <a:ln w="6350">
+                        <a:noFill/>
+                      </a:ln>
+                    </wps:spPr>
+                    <wps:txbx>
+                      <w:txbxContent>
+                        <w:p>
+                          <w:pPr>
+                            <w:rPr>
+                              <w:rFonts w:ascii="Noto Sans" w:hAnsi="Noto Sans" w:cs="Noto Sans"/>
+                              <w:color w:val="10373E"/>
+                              <w:sz w:val="16"/>
+                              <w:szCs w:val="16"/>
+                            </w:rPr>
+                          </w:pPr>
+                          <w:r>
+                            <w:rPr>
+                              <w:rFonts w:ascii="Noto Sans" w:hAnsi="Noto Sans" w:cs="Noto Sans"/>
+                              <w:color w:val="10373E"/>
+                              <w:sz w:val="16"/>
+                              <w:szCs w:val="16"/>
+                            </w:rPr>
+                            <w:t>https://theahg.co.za</w:t>
+                          </w:r>
+                        </w:p>
+                      </w:txbxContent>
+                    </wps:txbx>
+                    <wps:bodyPr rot="0" spcFirstLastPara="0" vertOverflow="overflow" horzOverflow="overflow" vert="horz" wrap="square" lIns="91440" tIns="45720" rIns="91440" bIns="45720" numCol="1" spcCol="0" rtlCol="0" fromWordArt="0" anchor="t" anchorCtr="0" forceAA="0" compatLnSpc="1">
+                      <a:prstTxWarp prst="textNoShape">
+                        <a:avLst/>
+                      </a:prstTxWarp>
+                      <a:noAutofit/>
+                    </wps:bodyPr>
+                  </wps:wsp>
+                </a:graphicData>
+              </a:graphic>
+              <wp14:sizeRelH relativeFrom="margin">
+                <wp14:pctWidth>0</wp14:pctWidth>
+              </wp14:sizeRelH>
+              <wp14:sizeRelV relativeFrom="margin">
+                <wp14:pctHeight>0</wp14:pctHeight>
+              </wp14:sizeRelV>
+            </wp:anchor>
+          </w:drawing>
+        </mc:Choice>
+        <mc:Fallback>
+          <w:pict>
+            <v:shape w14:anchorId="6B6A3860" id="_x0000_s1030" type="#_x0000_t202" style="position:absolute;margin-left:200.1pt;margin-top:10.55pt;width:91.95pt;height:21.35pt;z-index:251660288;visibility:visible;mso-wrap-style:square;mso-width-percent:0;mso-height-percent:0;mso-wrap-distance-left:9pt;mso-wrap-distance-top:0;mso-wrap-distance-right:9pt;mso-wrap-distance-bottom:0;mso-position-horizontal:absolute;mso-position-horizontal-relative:text;mso-position-vertical:absolute;mso-position-vertical-relative:text;mso-width-percent:0;mso-height-percent:0;mso-width-relative:margin;mso-height-relative:margin;v-text-anchor:top" o:gfxdata="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" filled="f" stroked="f" strokeweight=".5pt">
+              <v:textbox>
+                <w:txbxContent>
+                  <w:p>
+                    <w:pPr>
+                      <w:rPr>
+                        <w:rFonts w:ascii="Noto Sans" w:hAnsi="Noto Sans" w:cs="Noto Sans"/>
+                        <w:color w:val="10373E"/>
+                        <w:sz w:val="16"/>
+                        <w:szCs w:val="16"/>
+                      </w:rPr>
+                    </w:pPr>
+                    <w:r>
+                      <w:rPr>
+                        <w:rFonts w:ascii="Noto Sans" w:hAnsi="Noto Sans" w:cs="Noto Sans"/>
+                        <w:color w:val="10373E"/>
+                        <w:sz w:val="16"/>
+                        <w:szCs w:val="16"/>
+                      </w:rPr>
+                      <w:t>https://theahg.co.za</w:t>
+                    </w:r>
+                  </w:p>
+                </w:txbxContent>
+              </v:textbox>
+            </v:shape>
+          </w:pict>
+        </mc:Fallback>
+      </mc:AlternateContent>
+    </w:r>
+    <w:r>
+      <w:rPr>
+        <w:noProof/>
+      </w:rPr>
+      <mc:AlternateContent>
+        <mc:Choice Requires="wps">
+          <w:drawing>
+            <wp:anchor distT="0" distB="0" distL="114300" distR="114300" simplePos="0" relativeHeight="251662336" behindDoc="0" locked="0" layoutInCell="1" allowOverlap="1" wp14:anchorId="413D3162" wp14:editId="03DE40C5">
+              <wp:simplePos x="0" y="0"/>
+              <wp:positionH relativeFrom="column">
+                <wp:posOffset>3906396</wp:posOffset>
+              </wp:positionH>
+              <wp:positionV relativeFrom="paragraph">
+                <wp:posOffset>-192405</wp:posOffset>
+              </wp:positionV>
+              <wp:extent cx="1167765" cy="222250"/>
+              <wp:effectExtent l="0" t="0" r="0" b="6350"/>
+              <wp:wrapNone/>
+              <wp:docPr id="940937639" name="Text Box 5"/>
+              <wp:cNvGraphicFramePr/>
+              <a:graphic xmlns:a="http://schemas.openxmlformats.org/drawingml/2006/main">
+                <a:graphicData uri="http://schemas.microsoft.com/office/word/2010/wordprocessingShape">
+                  <wps:wsp>
+                    <wps:cNvSpPr txBox="1"/>
+                    <wps:spPr>
+                      <a:xfrm>
+                        <a:off x="0" y="0"/>
+                        <a:ext cx="1167765" cy="222250"/>
+                      </a:xfrm>
+                      <a:prstGeom prst="rect">
+                        <a:avLst/>
+                      </a:prstGeom>
+                      <a:noFill/>
+                      <a:ln w="6350">
+                        <a:noFill/>
+                      </a:ln>
+                    </wps:spPr>
+                    <wps:txbx>
+                      <w:txbxContent>
+                        <w:p>
+                          <w:pPr>
+                            <w:rPr>
+                              <w:rFonts w:ascii="Noto Sans" w:hAnsi="Noto Sans" w:cs="Noto Sans"/>
+                              <w:color w:val="10373E"/>
+                              <w:sz w:val="16"/>
+                              <w:szCs w:val="16"/>
+                            </w:rPr>
+                          </w:pPr>
+                          <w:r>
+                            <w:rPr>
+                              <w:rFonts w:ascii="Noto Sans" w:hAnsi="Noto Sans" w:cs="Noto Sans"/>
+                              <w:color w:val="10373E"/>
+                              <w:sz w:val="16"/>
+                              <w:szCs w:val="16"/>
+                            </w:rPr>
+                            <w:t xml:space="preserve">+27 </w:t>
+                          </w:r>
+                          <w:r>
+                            <w:rPr>
+                              <w:rFonts w:ascii="Noto Sans" w:hAnsi="Noto Sans" w:cs="Noto Sans"/>
+                              <w:color w:val="10373E"/>
+                              <w:sz w:val="16"/>
+                              <w:szCs w:val="16"/>
+                            </w:rPr>
+                            <w:t>87</w:t>
+                          </w:r>
+                          <w:r>
+                            <w:rPr>
+                              <w:rFonts w:ascii="Noto Sans" w:hAnsi="Noto Sans" w:cs="Noto Sans"/>
+                              <w:color w:val="10373E"/>
+                              <w:sz w:val="16"/>
+                              <w:szCs w:val="16"/>
+                            </w:rPr>
+                            <w:t> </w:t>
+                          </w:r>
+                          <w:r>
+                            <w:rPr>
+                              <w:rFonts w:ascii="Noto Sans" w:hAnsi="Noto Sans" w:cs="Noto Sans"/>
+                              <w:color w:val="10373E"/>
+                              <w:sz w:val="16"/>
+                              <w:szCs w:val="16"/>
+                            </w:rPr>
+                            <w:t>265</w:t>
+                          </w:r>
+                          <w:r>
+                            <w:rPr>
+                              <w:rFonts w:ascii="Noto Sans" w:hAnsi="Noto Sans" w:cs="Noto Sans"/>
+                              <w:color w:val="10373E"/>
+                              <w:sz w:val="16"/>
+                              <w:szCs w:val="16"/>
+                            </w:rPr>
+                            <w:t xml:space="preserve"> </w:t>
+                          </w:r>
+                          <w:r>
+                            <w:rPr>
+                              <w:rFonts w:ascii="Noto Sans" w:hAnsi="Noto Sans" w:cs="Noto Sans"/>
+                              <w:color w:val="10373E"/>
+                              <w:sz w:val="16"/>
+                              <w:szCs w:val="16"/>
+                            </w:rPr>
+                            <w:t>5297</w:t>
+                          </w:r>
+                        </w:p>
+                      </w:txbxContent>
+                    </wps:txbx>
+                    <wps:bodyPr rot="0" spcFirstLastPara="0" vertOverflow="overflow" horzOverflow="overflow" vert="horz" wrap="square" lIns="91440" tIns="45720" rIns="91440" bIns="45720" numCol="1" spcCol="0" rtlCol="0" fromWordArt="0" anchor="t" anchorCtr="0" forceAA="0" compatLnSpc="1">
+                      <a:prstTxWarp prst="textNoShape">
+                        <a:avLst/>
+                      </a:prstTxWarp>
+                      <a:noAutofit/>
+                    </wps:bodyPr>
+                  </wps:wsp>
+                </a:graphicData>
+              </a:graphic>
+              <wp14:sizeRelH relativeFrom="margin">
+                <wp14:pctWidth>0</wp14:pctWidth>
+              </wp14:sizeRelH>
+              <wp14:sizeRelV relativeFrom="margin">
+                <wp14:pctHeight>0</wp14:pctHeight>
+              </wp14:sizeRelV>
+            </wp:anchor>
+          </w:drawing>
+        </mc:Choice>
+        <mc:Fallback>
+          <w:pict>
+            <v:shape w14:anchorId="413D3162" id="_x0000_s1031" type="#_x0000_t202" style="position:absolute;margin-left:307.6pt;margin-top:-15.15pt;width:91.95pt;height:17.5pt;z-index:251662336;visibility:visible;mso-wrap-style:square;mso-width-percent:0;mso-height-percent:0;mso-wrap-distance-left:9pt;mso-wrap-distance-top:0;mso-wrap-distance-right:9pt;mso-wrap-distance-bottom:0;mso-position-horizontal:absolute;mso-position-horizontal-relative:text;mso-position-vertical:absolute;mso-position-vertical-relative:text;mso-width-percent:0;mso-height-percent:0;mso-width-relative:margin;mso-height-relative:margin;v-text-anchor:top" o:gfxdata="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" filled="f" stroked="f" strokeweight=".5pt">
+              <v:textbox>
+                <w:txbxContent>
+                  <w:p>
+                    <w:pPr>
+                      <w:rPr>
+                        <w:rFonts w:ascii="Noto Sans" w:hAnsi="Noto Sans" w:cs="Noto Sans"/>
+                        <w:color w:val="10373E"/>
+                        <w:sz w:val="16"/>
+                        <w:szCs w:val="16"/>
+                      </w:rPr>
+                    </w:pPr>
+                    <w:r>
+                      <w:rPr>
+                        <w:rFonts w:ascii="Noto Sans" w:hAnsi="Noto Sans" w:cs="Noto Sans"/>
+                        <w:color w:val="10373E"/>
+                        <w:sz w:val="16"/>
+                        <w:szCs w:val="16"/>
+                      </w:rPr>
+                      <w:t xml:space="preserve">+27 </w:t>
+                    </w:r>
+                    <w:r>
+                      <w:rPr>
+                        <w:rFonts w:ascii="Noto Sans" w:hAnsi="Noto Sans" w:cs="Noto Sans"/>
+                        <w:color w:val="10373E"/>
+                        <w:sz w:val="16"/>
+                        <w:szCs w:val="16"/>
+                      </w:rPr>
+                      <w:t>87</w:t>
+                    </w:r>
+                    <w:r>
+                      <w:rPr>
+                        <w:rFonts w:ascii="Noto Sans" w:hAnsi="Noto Sans" w:cs="Noto Sans"/>
+                        <w:color w:val="10373E"/>
+                        <w:sz w:val="16"/>
+                        <w:szCs w:val="16"/>
+                      </w:rPr>
+                      <w:t> </w:t>
+                    </w:r>
+                    <w:r>
+                      <w:rPr>
+                        <w:rFonts w:ascii="Noto Sans" w:hAnsi="Noto Sans" w:cs="Noto Sans"/>
+                        <w:color w:val="10373E"/>
+                        <w:sz w:val="16"/>
+                        <w:szCs w:val="16"/>
+                      </w:rPr>
+                      <w:t>265</w:t>
+                    </w:r>
+                    <w:r>
+                      <w:rPr>
+                        <w:rFonts w:ascii="Noto Sans" w:hAnsi="Noto Sans" w:cs="Noto Sans"/>
+                        <w:color w:val="10373E"/>
+                        <w:sz w:val="16"/>
+                        <w:szCs w:val="16"/>
+                      </w:rPr>
+                      <w:t xml:space="preserve"> </w:t>
+                    </w:r>
+                    <w:r>
+                      <w:rPr>
+                        <w:rFonts w:ascii="Noto Sans" w:hAnsi="Noto Sans" w:cs="Noto Sans"/>
+                        <w:color w:val="10373E"/>
+                        <w:sz w:val="16"/>
+                        <w:szCs w:val="16"/>
+                      </w:rPr>
+                      <w:t>5297</w:t>
+                    </w:r>
+                  </w:p>
+                </w:txbxContent>
+              </v:textbox>
+            </v:shape>
+          </w:pict>
+        </mc:Fallback>
+      </mc:AlternateContent>
+    </w:r>
+  </w:p>
+  <w:p>
+    <w:pPr>
+      <w:pStyle w:val="Header"/>
+    </w:pPr>
+  </w:p>
+</w:hdr>
 </file>
 
 <file path=word/numbering.xml><?xml version="1.0" encoding="utf-8"?>
@@ -1467,7 +4052,7 @@
         <w:rFonts w:ascii="Arial" w:cs="Arial" w:eastAsia="Arial" w:hAnsi="Arial"/>
         <w:sz w:val="24"/>
         <w:szCs w:val="24"/>
-        <w:lang w:bidi="ar-SA" w:eastAsia="en-US" w:val="en-US"/>
+        <w:lang w:bidi="ar-SA" w:eastAsia="en-ZA" w:val="en-ZA"/>
       </w:rPr>
     </w:rPrDefault>
     <w:pPrDefault>
@@ -1480,6 +4065,9 @@
   <w:style w:default="1" w:styleId="Normal" w:type="paragraph">
     <w:name w:val="Normal"/>
     <w:qFormat/>
+    <w:pPr>
+      <w:jc w:val="both"/>
+    </w:pPr>
   </w:style>
   <w:style w:styleId="BodyText" w:type="paragraph">
     <w:name w:val="Body Text"/>
@@ -1487,6 +4075,7 @@
     <w:link w:val="BodyTextChar"/>
     <w:pPr>
       <w:spacing w:after="180" w:before="180"/>
+      <w:jc w:val="both"/>
     </w:pPr>
     <w:qFormat/>
   </w:style>
@@ -1495,6 +4084,9 @@
     <w:basedOn w:val="BodyText"/>
     <w:next w:val="BodyText"/>
     <w:qFormat/>
+    <w:pPr>
+      <w:jc w:val="both"/>
+    </w:pPr>
   </w:style>
   <w:style w:customStyle="1" w:styleId="Compact" w:type="paragraph">
     <w:name w:val="Compact"/>
@@ -1818,31 +4410,32 @@
   <w:style w:default="1" w:styleId="Table" w:type="table">
     <w:name w:val="Table"/>
     <w:basedOn w:val="TableNormal"/>
-    <w:semiHidden/>
-    <w:unhideWhenUsed/>
     <w:qFormat/>
     <w:tblPr>
       <w:tblInd w:type="dxa" w:w="0"/>
+      <w:tblBorders>
+        <w:top w:color="595959" w:space="0" w:sz="4" w:val="single"/>
+        <w:left w:color="595959" w:space="0" w:sz="4" w:val="single"/>
+        <w:bottom w:color="595959" w:space="0" w:sz="4" w:val="single"/>
+        <w:right w:color="595959" w:space="0" w:sz="4" w:val="single"/>
+        <w:insideH w:color="595959" w:space="0" w:sz="4" w:val="single"/>
+        <w:insideV w:color="595959" w:space="0" w:sz="4" w:val="single"/>
+      </w:tblBorders>
       <w:tblCellMar>
-        <w:top w:type="dxa" w:w="0"/>
+        <w:top w:type="dxa" w:w="60"/>
         <w:left w:type="dxa" w:w="108"/>
-        <w:bottom w:type="dxa" w:w="0"/>
+        <w:bottom w:type="dxa" w:w="60"/>
         <w:right w:type="dxa" w:w="108"/>
       </w:tblCellMar>
     </w:tblPr>
     <w:tblStylePr w:type="firstRow">
-      <w:tblPr>
-        <w:jc w:val="left"/>
-        <w:tblInd w:type="dxa" w:w="0"/>
-      </w:tblPr>
-      <w:trPr>
-        <w:jc w:val="left"/>
-      </w:trPr>
+      <w:rPr>
+        <w:b/>
+        <w:color w:val="FFFFFF"/>
+      </w:rPr>
       <w:tcPr>
-        <w:vAlign w:val="bottom"/>
-        <w:tcBorders>
-          <w:bottom w:val="single"/>
-        </w:tcBorders>
+        <w:shd w:color="auto" w:fill="10373E" w:val="clear"/>
+        <w:vAlign w:val="center"/>
       </w:tcPr>
     </w:tblStylePr>
   </w:style>

</xml_diff>